<commit_message>
docs: update API specification, database schema, and project docs
</commit_message>
<xml_diff>
--- a/docs/Project 1 Portfolio.docx
+++ b/docs/Project 1 Portfolio.docx
@@ -1,6 +1,7 @@
 
 <file path=word/document.xml><?xml version="1.0" encoding="utf-8"?>
 <w:document xmlns:wpc="http://schemas.microsoft.com/office/word/2010/wordprocessingCanvas" xmlns:cx="http://schemas.microsoft.com/office/drawing/2014/chartex" xmlns:cx1="http://schemas.microsoft.com/office/drawing/2015/9/8/chartex" xmlns:cx2="http://schemas.microsoft.com/office/drawing/2015/10/21/chartex" xmlns:cx3="http://schemas.microsoft.com/office/drawing/2016/5/9/chartex" xmlns:cx4="http://schemas.microsoft.com/office/drawing/2016/5/10/chartex" xmlns:cx5="http://schemas.microsoft.com/office/drawing/2016/5/11/chartex" xmlns:cx6="http://schemas.microsoft.com/office/drawing/2016/5/12/chartex" xmlns:cx7="http://schemas.microsoft.com/office/drawing/2016/5/13/chartex" xmlns:cx8="http://schemas.microsoft.com/office/drawing/2016/5/14/chartex" xmlns:mc="http://schemas.openxmlformats.org/markup-compatibility/2006" xmlns:aink="http://schemas.microsoft.com/office/drawing/2016/ink" xmlns:am3d="http://schemas.microsoft.com/office/drawing/2017/model3d" xmlns:o="urn:schemas-microsoft-com:office:office" xmlns:oel="http://schemas.microsoft.com/office/2019/extlst" xmlns:r="http://schemas.openxmlformats.org/officeDocument/2006/relationships" xmlns:m="http://schemas.openxmlformats.org/officeDocument/2006/math" xmlns:v="urn:schemas-microsoft-com:vml" xmlns:wp14="http://schemas.microsoft.com/office/word/2010/wordprocessingDrawing" xmlns:wp="http://schemas.openxmlformats.org/drawingml/2006/wordprocessingDrawing" xmlns:w10="urn:schemas-microsoft-com:office:word" xmlns:w="http://schemas.openxmlformats.org/wordprocessingml/2006/main" xmlns:w14="http://schemas.microsoft.com/office/word/2010/wordml" xmlns:w15="http://schemas.microsoft.com/office/word/2012/wordml" xmlns:w16cex="http://schemas.microsoft.com/office/word/2018/wordml/cex" xmlns:w16cid="http://schemas.microsoft.com/office/word/2016/wordml/cid" xmlns:w16="http://schemas.microsoft.com/office/word/2018/wordml" xmlns:w16du="http://schemas.microsoft.com/office/word/2023/wordml/word16du" xmlns:w16sdtdh="http://schemas.microsoft.com/office/word/2020/wordml/sdtdatahash" xmlns:w16sdtfl="http://schemas.microsoft.com/office/word/2024/wordml/sdtformatlock" xmlns:w16se="http://schemas.microsoft.com/office/word/2015/wordml/symex" xmlns:wpg="http://schemas.microsoft.com/office/word/2010/wordprocessingGroup" xmlns:wpi="http://schemas.microsoft.com/office/word/2010/wordprocessingInk" xmlns:wne="http://schemas.microsoft.com/office/word/2006/wordml" xmlns:wps="http://schemas.microsoft.com/office/word/2010/wordprocessingShape" mc:Ignorable="w14 w15 w16se w16cid w16 w16cex w16sdtdh w16sdtfl w16du wp14">
+  <w:background w:color="FFFFFF" w:themeColor="background1"/>
   <w:body>
     <w:p>
       <w:pPr>
@@ -367,62 +368,27 @@
           <w:sz w:val="20"/>
           <w:szCs w:val="20"/>
         </w:rPr>
-        <w:t xml:space="preserve">Visitor, HR, recruiter, Owner </w:t>
-      </w:r>
-      <w:proofErr w:type="spellStart"/>
-      <w:r>
-        <w:rPr>
-          <w:rFonts w:ascii="Poppins" w:hAnsi="Poppins" w:cs="Poppins"/>
-          <w:sz w:val="20"/>
-          <w:szCs w:val="20"/>
-        </w:rPr>
-        <w:t>gans</w:t>
-      </w:r>
-      <w:proofErr w:type="spellEnd"/>
-      <w:r>
-        <w:rPr>
-          <w:rFonts w:ascii="Poppins" w:hAnsi="Poppins" w:cs="Poppins"/>
-          <w:sz w:val="20"/>
-          <w:szCs w:val="20"/>
-        </w:rPr>
-        <w:t xml:space="preserve"> dan </w:t>
-      </w:r>
-      <w:proofErr w:type="spellStart"/>
-      <w:r>
-        <w:rPr>
-          <w:rFonts w:ascii="Poppins" w:hAnsi="Poppins" w:cs="Poppins"/>
-          <w:sz w:val="20"/>
-          <w:szCs w:val="20"/>
-        </w:rPr>
-        <w:t>calon</w:t>
-      </w:r>
-      <w:proofErr w:type="spellEnd"/>
-      <w:r>
-        <w:rPr>
-          <w:rFonts w:ascii="Poppins" w:hAnsi="Poppins" w:cs="Poppins"/>
-          <w:sz w:val="20"/>
-          <w:szCs w:val="20"/>
-        </w:rPr>
-        <w:t xml:space="preserve"> </w:t>
-      </w:r>
-      <w:proofErr w:type="spellStart"/>
-      <w:r>
-        <w:rPr>
-          <w:rFonts w:ascii="Poppins" w:hAnsi="Poppins" w:cs="Poppins"/>
-          <w:sz w:val="20"/>
-          <w:szCs w:val="20"/>
-        </w:rPr>
-        <w:t>konglo</w:t>
-      </w:r>
-      <w:proofErr w:type="spellEnd"/>
-      <w:r>
-        <w:rPr>
-          <w:rFonts w:ascii="Poppins" w:hAnsi="Poppins" w:cs="Poppins"/>
-          <w:sz w:val="20"/>
-          <w:szCs w:val="20"/>
-        </w:rPr>
-        <w:t>(admin)</w:t>
-      </w:r>
+        <w:t xml:space="preserve">Visitor, HR, recruiter, </w:t>
+      </w:r>
+      <w:r>
+        <w:rPr>
+          <w:rFonts w:ascii="Poppins" w:hAnsi="Poppins" w:cs="Poppins"/>
+          <w:sz w:val="20"/>
+          <w:szCs w:val="20"/>
+        </w:rPr>
+        <w:t>Administrator</w:t>
+      </w:r>
+    </w:p>
+    <w:p>
+      <w:pPr>
+        <w:pStyle w:val="ListParagraph"/>
+        <w:jc w:val="both"/>
+        <w:rPr>
+          <w:rFonts w:ascii="Poppins" w:hAnsi="Poppins" w:cs="Poppins"/>
+          <w:sz w:val="20"/>
+          <w:szCs w:val="20"/>
+        </w:rPr>
+      </w:pPr>
     </w:p>
     <w:p>
       <w:pPr>
@@ -627,7 +593,32 @@
                 <w:sz w:val="20"/>
                 <w:szCs w:val="20"/>
               </w:rPr>
-              <w:t xml:space="preserve"> Certificate, </w:t>
+              <w:t xml:space="preserve"> </w:t>
+            </w:r>
+            <w:proofErr w:type="gramStart"/>
+            <w:r>
+              <w:rPr>
+                <w:rFonts w:ascii="Poppins" w:hAnsi="Poppins" w:cs="Poppins"/>
+                <w:sz w:val="20"/>
+                <w:szCs w:val="20"/>
+              </w:rPr>
+              <w:t>Certificate,</w:t>
+            </w:r>
+            <w:r>
+              <w:rPr>
+                <w:rFonts w:ascii="Poppins" w:hAnsi="Poppins" w:cs="Poppins"/>
+                <w:sz w:val="20"/>
+                <w:szCs w:val="20"/>
+              </w:rPr>
+              <w:t xml:space="preserve"> </w:t>
+            </w:r>
+            <w:r>
+              <w:rPr>
+                <w:rFonts w:ascii="Poppins" w:hAnsi="Poppins" w:cs="Poppins"/>
+                <w:sz w:val="20"/>
+                <w:szCs w:val="20"/>
+              </w:rPr>
+              <w:t xml:space="preserve"> </w:t>
             </w:r>
             <w:proofErr w:type="spellStart"/>
             <w:r>
@@ -639,6 +630,7 @@
               <w:t>Melihat</w:t>
             </w:r>
             <w:proofErr w:type="spellEnd"/>
+            <w:proofErr w:type="gramEnd"/>
             <w:r>
               <w:rPr>
                 <w:rFonts w:ascii="Poppins" w:hAnsi="Poppins" w:cs="Poppins"/>
@@ -657,6 +649,32 @@
               <w:t>pesan</w:t>
             </w:r>
             <w:proofErr w:type="spellEnd"/>
+            <w:r>
+              <w:rPr>
+                <w:rFonts w:ascii="Poppins" w:hAnsi="Poppins" w:cs="Poppins"/>
+                <w:sz w:val="20"/>
+                <w:szCs w:val="20"/>
+              </w:rPr>
+              <w:t xml:space="preserve">, </w:t>
+            </w:r>
+            <w:proofErr w:type="spellStart"/>
+            <w:r>
+              <w:rPr>
+                <w:rFonts w:ascii="Poppins" w:hAnsi="Poppins" w:cs="Poppins"/>
+                <w:sz w:val="20"/>
+                <w:szCs w:val="20"/>
+              </w:rPr>
+              <w:t>membuka</w:t>
+            </w:r>
+            <w:proofErr w:type="spellEnd"/>
+            <w:r>
+              <w:rPr>
+                <w:rFonts w:ascii="Poppins" w:hAnsi="Poppins" w:cs="Poppins"/>
+                <w:sz w:val="20"/>
+                <w:szCs w:val="20"/>
+              </w:rPr>
+              <w:t xml:space="preserve"> social media</w:t>
+            </w:r>
           </w:p>
         </w:tc>
       </w:tr>
@@ -707,93 +725,383 @@
                 <w:sz w:val="20"/>
                 <w:szCs w:val="20"/>
               </w:rPr>
-              <w:t xml:space="preserve">Login, </w:t>
-            </w:r>
-            <w:proofErr w:type="gramStart"/>
-            <w:r>
-              <w:rPr>
-                <w:rFonts w:ascii="Poppins" w:hAnsi="Poppins" w:cs="Poppins"/>
-                <w:sz w:val="20"/>
-                <w:szCs w:val="20"/>
-              </w:rPr>
-              <w:t>Logout,  Dashboard</w:t>
-            </w:r>
-            <w:proofErr w:type="gramEnd"/>
-            <w:r>
-              <w:rPr>
-                <w:rFonts w:ascii="Poppins" w:hAnsi="Poppins" w:cs="Poppins"/>
-                <w:sz w:val="20"/>
-                <w:szCs w:val="20"/>
-              </w:rPr>
-              <w:t xml:space="preserve">, CRUD Hero, CRUD About, CRUD Skill, CRUD Experience, CRUD Project, CRUD Certificate, CRUD </w:t>
-            </w:r>
-            <w:proofErr w:type="gramStart"/>
-            <w:r>
-              <w:rPr>
-                <w:rFonts w:ascii="Poppins" w:hAnsi="Poppins" w:cs="Poppins"/>
-                <w:sz w:val="20"/>
-                <w:szCs w:val="20"/>
-              </w:rPr>
-              <w:t>Social Media</w:t>
-            </w:r>
-            <w:proofErr w:type="gramEnd"/>
-            <w:r>
-              <w:rPr>
-                <w:rFonts w:ascii="Poppins" w:hAnsi="Poppins" w:cs="Poppins"/>
-                <w:sz w:val="20"/>
-                <w:szCs w:val="20"/>
-              </w:rPr>
-              <w:t xml:space="preserve">, CRUD Contact Info, Upload CV, Upload Image, SEO Setting, </w:t>
-            </w:r>
-            <w:r>
-              <w:rPr>
-                <w:rFonts w:ascii="Poppins" w:hAnsi="Poppins" w:cs="Poppins"/>
-                <w:sz w:val="20"/>
-                <w:szCs w:val="20"/>
-              </w:rPr>
-              <w:t>CRUD</w:t>
-            </w:r>
-            <w:r>
-              <w:rPr>
-                <w:rFonts w:ascii="Poppins" w:hAnsi="Poppins" w:cs="Poppins"/>
-                <w:sz w:val="20"/>
-                <w:szCs w:val="20"/>
-              </w:rPr>
-              <w:t xml:space="preserve"> Setting, SMTP Test (</w:t>
-            </w:r>
-            <w:proofErr w:type="spellStart"/>
-            <w:r>
-              <w:rPr>
-                <w:rFonts w:ascii="Poppins" w:hAnsi="Poppins" w:cs="Poppins"/>
-                <w:sz w:val="20"/>
-                <w:szCs w:val="20"/>
-              </w:rPr>
-              <w:t>opsional</w:t>
-            </w:r>
-            <w:proofErr w:type="spellEnd"/>
-            <w:r>
-              <w:rPr>
-                <w:rFonts w:ascii="Poppins" w:hAnsi="Poppins" w:cs="Poppins"/>
-                <w:sz w:val="20"/>
-                <w:szCs w:val="20"/>
-              </w:rPr>
-              <w:t>)</w:t>
-            </w:r>
-            <w:r>
-              <w:rPr>
-                <w:rFonts w:ascii="Poppins" w:hAnsi="Poppins" w:cs="Poppins"/>
-                <w:sz w:val="20"/>
-                <w:szCs w:val="20"/>
-              </w:rPr>
-              <w:t xml:space="preserve">, </w:t>
-            </w:r>
-            <w:r>
-              <w:rPr>
-                <w:rFonts w:ascii="Poppins" w:hAnsi="Poppins" w:cs="Poppins"/>
-                <w:sz w:val="20"/>
-                <w:szCs w:val="20"/>
-              </w:rPr>
-              <w:t>Manage Site Settings</w:t>
+              <w:t>Authentication</w:t>
+            </w:r>
+          </w:p>
+          <w:p>
+            <w:pPr>
+              <w:rPr>
+                <w:rFonts w:ascii="Poppins" w:hAnsi="Poppins" w:cs="Poppins"/>
+                <w:sz w:val="20"/>
+                <w:szCs w:val="20"/>
+              </w:rPr>
+            </w:pPr>
+            <w:r>
+              <w:rPr>
+                <w:rFonts w:ascii="Poppins" w:hAnsi="Poppins" w:cs="Poppins"/>
+                <w:sz w:val="20"/>
+                <w:szCs w:val="20"/>
+              </w:rPr>
+              <w:t>- Login</w:t>
+            </w:r>
+          </w:p>
+          <w:p>
+            <w:pPr>
+              <w:rPr>
+                <w:rFonts w:ascii="Poppins" w:hAnsi="Poppins" w:cs="Poppins"/>
+                <w:sz w:val="20"/>
+                <w:szCs w:val="20"/>
+              </w:rPr>
+            </w:pPr>
+            <w:r>
+              <w:rPr>
+                <w:rFonts w:ascii="Poppins" w:hAnsi="Poppins" w:cs="Poppins"/>
+                <w:sz w:val="20"/>
+                <w:szCs w:val="20"/>
+              </w:rPr>
+              <w:t>- Logout</w:t>
+            </w:r>
+          </w:p>
+          <w:p>
+            <w:pPr>
+              <w:rPr>
+                <w:rFonts w:ascii="Poppins" w:hAnsi="Poppins" w:cs="Poppins"/>
+                <w:sz w:val="20"/>
+                <w:szCs w:val="20"/>
+              </w:rPr>
+            </w:pPr>
+          </w:p>
+          <w:p>
+            <w:pPr>
+              <w:rPr>
+                <w:rFonts w:ascii="Poppins" w:hAnsi="Poppins" w:cs="Poppins"/>
+                <w:sz w:val="20"/>
+                <w:szCs w:val="20"/>
+              </w:rPr>
+            </w:pPr>
+            <w:r>
+              <w:rPr>
+                <w:rFonts w:ascii="Poppins" w:hAnsi="Poppins" w:cs="Poppins"/>
+                <w:sz w:val="20"/>
+                <w:szCs w:val="20"/>
+              </w:rPr>
+              <w:t>Content Management</w:t>
+            </w:r>
+          </w:p>
+          <w:p>
+            <w:pPr>
+              <w:rPr>
+                <w:rFonts w:ascii="Poppins" w:hAnsi="Poppins" w:cs="Poppins"/>
+                <w:sz w:val="20"/>
+                <w:szCs w:val="20"/>
+              </w:rPr>
+            </w:pPr>
+            <w:r>
+              <w:rPr>
+                <w:rFonts w:ascii="Poppins" w:hAnsi="Poppins" w:cs="Poppins"/>
+                <w:sz w:val="20"/>
+                <w:szCs w:val="20"/>
+              </w:rPr>
+              <w:t>- CRUD Hero</w:t>
+            </w:r>
+          </w:p>
+          <w:p>
+            <w:pPr>
+              <w:rPr>
+                <w:rFonts w:ascii="Poppins" w:hAnsi="Poppins" w:cs="Poppins"/>
+                <w:sz w:val="20"/>
+                <w:szCs w:val="20"/>
+              </w:rPr>
+            </w:pPr>
+            <w:r>
+              <w:rPr>
+                <w:rFonts w:ascii="Poppins" w:hAnsi="Poppins" w:cs="Poppins"/>
+                <w:sz w:val="20"/>
+                <w:szCs w:val="20"/>
+              </w:rPr>
+              <w:t>- CRUD About</w:t>
+            </w:r>
+          </w:p>
+          <w:p>
+            <w:pPr>
+              <w:rPr>
+                <w:rFonts w:ascii="Poppins" w:hAnsi="Poppins" w:cs="Poppins"/>
+                <w:sz w:val="20"/>
+                <w:szCs w:val="20"/>
+              </w:rPr>
+            </w:pPr>
+            <w:r>
+              <w:rPr>
+                <w:rFonts w:ascii="Poppins" w:hAnsi="Poppins" w:cs="Poppins"/>
+                <w:sz w:val="20"/>
+                <w:szCs w:val="20"/>
+              </w:rPr>
+              <w:t>- CRUD Skills</w:t>
+            </w:r>
+          </w:p>
+          <w:p>
+            <w:pPr>
+              <w:rPr>
+                <w:rFonts w:ascii="Poppins" w:hAnsi="Poppins" w:cs="Poppins"/>
+                <w:sz w:val="20"/>
+                <w:szCs w:val="20"/>
+              </w:rPr>
+            </w:pPr>
+            <w:r>
+              <w:rPr>
+                <w:rFonts w:ascii="Poppins" w:hAnsi="Poppins" w:cs="Poppins"/>
+                <w:sz w:val="20"/>
+                <w:szCs w:val="20"/>
+              </w:rPr>
+              <w:t>- CRUD Education</w:t>
+            </w:r>
+          </w:p>
+          <w:p>
+            <w:pPr>
+              <w:rPr>
+                <w:rFonts w:ascii="Poppins" w:hAnsi="Poppins" w:cs="Poppins"/>
+                <w:sz w:val="20"/>
+                <w:szCs w:val="20"/>
+              </w:rPr>
+            </w:pPr>
+            <w:r>
+              <w:rPr>
+                <w:rFonts w:ascii="Poppins" w:hAnsi="Poppins" w:cs="Poppins"/>
+                <w:sz w:val="20"/>
+                <w:szCs w:val="20"/>
+              </w:rPr>
+              <w:t>- CRUD Experience</w:t>
+            </w:r>
+          </w:p>
+          <w:p>
+            <w:pPr>
+              <w:rPr>
+                <w:rFonts w:ascii="Poppins" w:hAnsi="Poppins" w:cs="Poppins"/>
+                <w:sz w:val="20"/>
+                <w:szCs w:val="20"/>
+              </w:rPr>
+            </w:pPr>
+            <w:r>
+              <w:rPr>
+                <w:rFonts w:ascii="Poppins" w:hAnsi="Poppins" w:cs="Poppins"/>
+                <w:sz w:val="20"/>
+                <w:szCs w:val="20"/>
+              </w:rPr>
+              <w:t>- CRUD Projects</w:t>
+            </w:r>
+          </w:p>
+          <w:p>
+            <w:pPr>
+              <w:rPr>
+                <w:rFonts w:ascii="Poppins" w:hAnsi="Poppins" w:cs="Poppins"/>
+                <w:sz w:val="20"/>
+                <w:szCs w:val="20"/>
+              </w:rPr>
+            </w:pPr>
+            <w:r>
+              <w:rPr>
+                <w:rFonts w:ascii="Poppins" w:hAnsi="Poppins" w:cs="Poppins"/>
+                <w:sz w:val="20"/>
+                <w:szCs w:val="20"/>
+              </w:rPr>
+              <w:t>- CRUD Certificates</w:t>
+            </w:r>
+          </w:p>
+          <w:p>
+            <w:pPr>
+              <w:rPr>
+                <w:rFonts w:ascii="Poppins" w:hAnsi="Poppins" w:cs="Poppins"/>
+                <w:sz w:val="20"/>
+                <w:szCs w:val="20"/>
+              </w:rPr>
+            </w:pPr>
+          </w:p>
+          <w:p>
+            <w:pPr>
+              <w:rPr>
+                <w:rFonts w:ascii="Poppins" w:hAnsi="Poppins" w:cs="Poppins"/>
+                <w:sz w:val="20"/>
+                <w:szCs w:val="20"/>
+              </w:rPr>
+            </w:pPr>
+            <w:r>
+              <w:rPr>
+                <w:rFonts w:ascii="Poppins" w:hAnsi="Poppins" w:cs="Poppins"/>
+                <w:sz w:val="20"/>
+                <w:szCs w:val="20"/>
+              </w:rPr>
+              <w:t>Media Management</w:t>
+            </w:r>
+          </w:p>
+          <w:p>
+            <w:pPr>
+              <w:rPr>
+                <w:rFonts w:ascii="Poppins" w:hAnsi="Poppins" w:cs="Poppins"/>
+                <w:sz w:val="20"/>
+                <w:szCs w:val="20"/>
+              </w:rPr>
+            </w:pPr>
+            <w:r>
+              <w:rPr>
+                <w:rFonts w:ascii="Poppins" w:hAnsi="Poppins" w:cs="Poppins"/>
+                <w:sz w:val="20"/>
+                <w:szCs w:val="20"/>
+              </w:rPr>
+              <w:t>- Upload Image</w:t>
+            </w:r>
+          </w:p>
+          <w:p>
+            <w:pPr>
+              <w:rPr>
+                <w:rFonts w:ascii="Poppins" w:hAnsi="Poppins" w:cs="Poppins"/>
+                <w:sz w:val="20"/>
+                <w:szCs w:val="20"/>
+              </w:rPr>
+            </w:pPr>
+            <w:r>
+              <w:rPr>
+                <w:rFonts w:ascii="Poppins" w:hAnsi="Poppins" w:cs="Poppins"/>
+                <w:sz w:val="20"/>
+                <w:szCs w:val="20"/>
+              </w:rPr>
+              <w:t>- Upload CV</w:t>
+            </w:r>
+          </w:p>
+          <w:p>
+            <w:pPr>
+              <w:rPr>
+                <w:rFonts w:ascii="Poppins" w:hAnsi="Poppins" w:cs="Poppins"/>
+                <w:sz w:val="20"/>
+                <w:szCs w:val="20"/>
+              </w:rPr>
+            </w:pPr>
+          </w:p>
+          <w:p>
+            <w:pPr>
+              <w:rPr>
+                <w:rFonts w:ascii="Poppins" w:hAnsi="Poppins" w:cs="Poppins"/>
+                <w:sz w:val="20"/>
+                <w:szCs w:val="20"/>
+              </w:rPr>
+            </w:pPr>
+            <w:r>
+              <w:rPr>
+                <w:rFonts w:ascii="Poppins" w:hAnsi="Poppins" w:cs="Poppins"/>
+                <w:sz w:val="20"/>
+                <w:szCs w:val="20"/>
+              </w:rPr>
+              <w:t>Settings</w:t>
+            </w:r>
+          </w:p>
+          <w:p>
+            <w:pPr>
+              <w:rPr>
+                <w:rFonts w:ascii="Poppins" w:hAnsi="Poppins" w:cs="Poppins"/>
+                <w:sz w:val="20"/>
+                <w:szCs w:val="20"/>
+              </w:rPr>
+            </w:pPr>
+            <w:r>
+              <w:rPr>
+                <w:rFonts w:ascii="Poppins" w:hAnsi="Poppins" w:cs="Poppins"/>
+                <w:sz w:val="20"/>
+                <w:szCs w:val="20"/>
+              </w:rPr>
+              <w:t>- Manage Social Media</w:t>
+            </w:r>
+          </w:p>
+          <w:p>
+            <w:pPr>
+              <w:rPr>
+                <w:rFonts w:ascii="Poppins" w:hAnsi="Poppins" w:cs="Poppins"/>
+                <w:sz w:val="20"/>
+                <w:szCs w:val="20"/>
+              </w:rPr>
+            </w:pPr>
+            <w:r>
+              <w:rPr>
+                <w:rFonts w:ascii="Poppins" w:hAnsi="Poppins" w:cs="Poppins"/>
+                <w:sz w:val="20"/>
+                <w:szCs w:val="20"/>
+              </w:rPr>
+              <w:t>- Manage Contact Info</w:t>
+            </w:r>
+          </w:p>
+          <w:p>
+            <w:pPr>
+              <w:rPr>
+                <w:rFonts w:ascii="Poppins" w:hAnsi="Poppins" w:cs="Poppins"/>
+                <w:sz w:val="20"/>
+                <w:szCs w:val="20"/>
+              </w:rPr>
+            </w:pPr>
+            <w:r>
+              <w:rPr>
+                <w:rFonts w:ascii="Poppins" w:hAnsi="Poppins" w:cs="Poppins"/>
+                <w:sz w:val="20"/>
+                <w:szCs w:val="20"/>
+              </w:rPr>
+              <w:t>- Manage Site Settings</w:t>
+            </w:r>
+          </w:p>
+          <w:p>
+            <w:pPr>
+              <w:rPr>
+                <w:rFonts w:ascii="Poppins" w:hAnsi="Poppins" w:cs="Poppins"/>
+                <w:sz w:val="20"/>
+                <w:szCs w:val="20"/>
+              </w:rPr>
+            </w:pPr>
+            <w:r>
+              <w:rPr>
+                <w:rFonts w:ascii="Poppins" w:hAnsi="Poppins" w:cs="Poppins"/>
+                <w:sz w:val="20"/>
+                <w:szCs w:val="20"/>
+              </w:rPr>
+              <w:t>- Manage SEO</w:t>
+            </w:r>
+          </w:p>
+          <w:p>
+            <w:pPr>
+              <w:rPr>
+                <w:rFonts w:ascii="Poppins" w:hAnsi="Poppins" w:cs="Poppins"/>
+                <w:sz w:val="20"/>
+                <w:szCs w:val="20"/>
+              </w:rPr>
+            </w:pPr>
+          </w:p>
+          <w:p>
+            <w:pPr>
+              <w:rPr>
+                <w:rFonts w:ascii="Poppins" w:hAnsi="Poppins" w:cs="Poppins"/>
+                <w:sz w:val="20"/>
+                <w:szCs w:val="20"/>
+              </w:rPr>
+            </w:pPr>
+            <w:r>
+              <w:rPr>
+                <w:rFonts w:ascii="Poppins" w:hAnsi="Poppins" w:cs="Poppins"/>
+                <w:sz w:val="20"/>
+                <w:szCs w:val="20"/>
+              </w:rPr>
+              <w:t>Utilities</w:t>
+            </w:r>
+          </w:p>
+          <w:p>
+            <w:pPr>
+              <w:rPr>
+                <w:rFonts w:ascii="Poppins" w:hAnsi="Poppins" w:cs="Poppins"/>
+                <w:sz w:val="20"/>
+                <w:szCs w:val="20"/>
+              </w:rPr>
+            </w:pPr>
+            <w:r>
+              <w:rPr>
+                <w:rFonts w:ascii="Poppins" w:hAnsi="Poppins" w:cs="Poppins"/>
+                <w:sz w:val="20"/>
+                <w:szCs w:val="20"/>
+              </w:rPr>
+              <w:t>- SMTP Test (Optional)</w:t>
             </w:r>
           </w:p>
         </w:tc>
@@ -829,6 +1137,7 @@
           <w:sz w:val="20"/>
           <w:szCs w:val="20"/>
         </w:rPr>
+        <w:lastRenderedPageBreak/>
         <w:t>Non Functional</w:t>
       </w:r>
       <w:proofErr w:type="gramEnd"/>
@@ -864,6 +1173,688 @@
                 <w:szCs w:val="20"/>
               </w:rPr>
               <w:t>Responsive, SEO, Fast Loading, Accessibility, Animation, Security, REST API, Maintainable</w:t>
+            </w:r>
+          </w:p>
+        </w:tc>
+      </w:tr>
+    </w:tbl>
+    <w:p>
+      <w:pPr>
+        <w:pStyle w:val="ListParagraph"/>
+        <w:jc w:val="both"/>
+        <w:rPr>
+          <w:rFonts w:ascii="Poppins" w:hAnsi="Poppins" w:cs="Poppins"/>
+          <w:b/>
+          <w:bCs/>
+          <w:sz w:val="20"/>
+          <w:szCs w:val="20"/>
+        </w:rPr>
+      </w:pPr>
+    </w:p>
+    <w:p>
+      <w:pPr>
+        <w:pStyle w:val="ListParagraph"/>
+        <w:jc w:val="both"/>
+        <w:rPr>
+          <w:rFonts w:ascii="Poppins" w:hAnsi="Poppins" w:cs="Poppins"/>
+          <w:sz w:val="20"/>
+          <w:szCs w:val="20"/>
+        </w:rPr>
+      </w:pPr>
+    </w:p>
+    <w:p>
+      <w:pPr>
+        <w:pStyle w:val="ListParagraph"/>
+        <w:numPr>
+          <w:ilvl w:val="0"/>
+          <w:numId w:val="1"/>
+        </w:numPr>
+        <w:jc w:val="both"/>
+        <w:rPr>
+          <w:rFonts w:ascii="Poppins" w:hAnsi="Poppins" w:cs="Poppins"/>
+          <w:b/>
+          <w:bCs/>
+          <w:sz w:val="20"/>
+          <w:szCs w:val="20"/>
+        </w:rPr>
+      </w:pPr>
+      <w:r>
+        <w:rPr>
+          <w:rFonts w:ascii="Poppins" w:hAnsi="Poppins" w:cs="Poppins"/>
+          <w:b/>
+          <w:bCs/>
+          <w:sz w:val="20"/>
+          <w:szCs w:val="20"/>
+        </w:rPr>
+        <w:t>Business Rules</w:t>
+      </w:r>
+    </w:p>
+    <w:tbl>
+      <w:tblPr>
+        <w:tblStyle w:val="TableGridLight"/>
+        <w:tblW w:w="9350" w:type="dxa"/>
+        <w:tblInd w:w="710" w:type="dxa"/>
+        <w:tblLook w:val="04A0" w:firstRow="1" w:lastRow="0" w:firstColumn="1" w:lastColumn="0" w:noHBand="0" w:noVBand="1"/>
+      </w:tblPr>
+      <w:tblGrid>
+        <w:gridCol w:w="9350"/>
+      </w:tblGrid>
+      <w:tr>
+        <w:tc>
+          <w:tcPr>
+            <w:tcW w:w="9350" w:type="dxa"/>
+          </w:tcPr>
+          <w:p>
+            <w:pPr>
+              <w:pStyle w:val="ListParagraph"/>
+              <w:numPr>
+                <w:ilvl w:val="0"/>
+                <w:numId w:val="4"/>
+              </w:numPr>
+              <w:jc w:val="both"/>
+              <w:rPr>
+                <w:rFonts w:ascii="Poppins" w:hAnsi="Poppins" w:cs="Poppins"/>
+                <w:sz w:val="20"/>
+                <w:szCs w:val="20"/>
+              </w:rPr>
+            </w:pPr>
+            <w:r>
+              <w:rPr>
+                <w:rFonts w:ascii="Poppins" w:hAnsi="Poppins" w:cs="Poppins"/>
+                <w:sz w:val="20"/>
+                <w:szCs w:val="20"/>
+              </w:rPr>
+              <w:t xml:space="preserve">Hanya admin yang </w:t>
+            </w:r>
+            <w:proofErr w:type="spellStart"/>
+            <w:r>
+              <w:rPr>
+                <w:rFonts w:ascii="Poppins" w:hAnsi="Poppins" w:cs="Poppins"/>
+                <w:sz w:val="20"/>
+                <w:szCs w:val="20"/>
+              </w:rPr>
+              <w:t>dapat</w:t>
+            </w:r>
+            <w:proofErr w:type="spellEnd"/>
+            <w:r>
+              <w:rPr>
+                <w:rFonts w:ascii="Poppins" w:hAnsi="Poppins" w:cs="Poppins"/>
+                <w:sz w:val="20"/>
+                <w:szCs w:val="20"/>
+              </w:rPr>
+              <w:t xml:space="preserve"> login.</w:t>
+            </w:r>
+          </w:p>
+          <w:p>
+            <w:pPr>
+              <w:pStyle w:val="ListParagraph"/>
+              <w:numPr>
+                <w:ilvl w:val="0"/>
+                <w:numId w:val="4"/>
+              </w:numPr>
+              <w:jc w:val="both"/>
+              <w:rPr>
+                <w:rFonts w:ascii="Poppins" w:hAnsi="Poppins" w:cs="Poppins"/>
+                <w:sz w:val="20"/>
+                <w:szCs w:val="20"/>
+              </w:rPr>
+            </w:pPr>
+            <w:proofErr w:type="spellStart"/>
+            <w:r>
+              <w:rPr>
+                <w:rFonts w:ascii="Poppins" w:hAnsi="Poppins" w:cs="Poppins"/>
+                <w:sz w:val="20"/>
+                <w:szCs w:val="20"/>
+              </w:rPr>
+              <w:t>Semua</w:t>
+            </w:r>
+            <w:proofErr w:type="spellEnd"/>
+            <w:r>
+              <w:rPr>
+                <w:rFonts w:ascii="Poppins" w:hAnsi="Poppins" w:cs="Poppins"/>
+                <w:sz w:val="20"/>
+                <w:szCs w:val="20"/>
+              </w:rPr>
+              <w:t xml:space="preserve"> data portfolio </w:t>
+            </w:r>
+            <w:proofErr w:type="spellStart"/>
+            <w:r>
+              <w:rPr>
+                <w:rFonts w:ascii="Poppins" w:hAnsi="Poppins" w:cs="Poppins"/>
+                <w:sz w:val="20"/>
+                <w:szCs w:val="20"/>
+              </w:rPr>
+              <w:t>dikelola</w:t>
+            </w:r>
+            <w:proofErr w:type="spellEnd"/>
+            <w:r>
+              <w:rPr>
+                <w:rFonts w:ascii="Poppins" w:hAnsi="Poppins" w:cs="Poppins"/>
+                <w:sz w:val="20"/>
+                <w:szCs w:val="20"/>
+              </w:rPr>
+              <w:t xml:space="preserve"> </w:t>
+            </w:r>
+            <w:proofErr w:type="spellStart"/>
+            <w:r>
+              <w:rPr>
+                <w:rFonts w:ascii="Poppins" w:hAnsi="Poppins" w:cs="Poppins"/>
+                <w:sz w:val="20"/>
+                <w:szCs w:val="20"/>
+              </w:rPr>
+              <w:t>melalui</w:t>
+            </w:r>
+            <w:proofErr w:type="spellEnd"/>
+            <w:r>
+              <w:rPr>
+                <w:rFonts w:ascii="Poppins" w:hAnsi="Poppins" w:cs="Poppins"/>
+                <w:sz w:val="20"/>
+                <w:szCs w:val="20"/>
+              </w:rPr>
+              <w:t xml:space="preserve"> Filament.</w:t>
+            </w:r>
+          </w:p>
+          <w:p>
+            <w:pPr>
+              <w:pStyle w:val="ListParagraph"/>
+              <w:numPr>
+                <w:ilvl w:val="0"/>
+                <w:numId w:val="4"/>
+              </w:numPr>
+              <w:jc w:val="both"/>
+              <w:rPr>
+                <w:rFonts w:ascii="Poppins" w:hAnsi="Poppins" w:cs="Poppins"/>
+                <w:sz w:val="20"/>
+                <w:szCs w:val="20"/>
+              </w:rPr>
+            </w:pPr>
+            <w:r>
+              <w:rPr>
+                <w:rFonts w:ascii="Poppins" w:hAnsi="Poppins" w:cs="Poppins"/>
+                <w:sz w:val="20"/>
+                <w:szCs w:val="20"/>
+              </w:rPr>
+              <w:t xml:space="preserve">Visitor </w:t>
+            </w:r>
+            <w:proofErr w:type="spellStart"/>
+            <w:r>
+              <w:rPr>
+                <w:rFonts w:ascii="Poppins" w:hAnsi="Poppins" w:cs="Poppins"/>
+                <w:sz w:val="20"/>
+                <w:szCs w:val="20"/>
+              </w:rPr>
+              <w:t>tidak</w:t>
+            </w:r>
+            <w:proofErr w:type="spellEnd"/>
+            <w:r>
+              <w:rPr>
+                <w:rFonts w:ascii="Poppins" w:hAnsi="Poppins" w:cs="Poppins"/>
+                <w:sz w:val="20"/>
+                <w:szCs w:val="20"/>
+              </w:rPr>
+              <w:t xml:space="preserve"> </w:t>
+            </w:r>
+            <w:proofErr w:type="spellStart"/>
+            <w:r>
+              <w:rPr>
+                <w:rFonts w:ascii="Poppins" w:hAnsi="Poppins" w:cs="Poppins"/>
+                <w:sz w:val="20"/>
+                <w:szCs w:val="20"/>
+              </w:rPr>
+              <w:t>membutuhkan</w:t>
+            </w:r>
+            <w:proofErr w:type="spellEnd"/>
+            <w:r>
+              <w:rPr>
+                <w:rFonts w:ascii="Poppins" w:hAnsi="Poppins" w:cs="Poppins"/>
+                <w:sz w:val="20"/>
+                <w:szCs w:val="20"/>
+              </w:rPr>
+              <w:t xml:space="preserve"> login.</w:t>
+            </w:r>
+          </w:p>
+          <w:p>
+            <w:pPr>
+              <w:pStyle w:val="ListParagraph"/>
+              <w:numPr>
+                <w:ilvl w:val="0"/>
+                <w:numId w:val="4"/>
+              </w:numPr>
+              <w:jc w:val="both"/>
+              <w:rPr>
+                <w:rFonts w:ascii="Poppins" w:hAnsi="Poppins" w:cs="Poppins"/>
+                <w:sz w:val="20"/>
+                <w:szCs w:val="20"/>
+              </w:rPr>
+            </w:pPr>
+            <w:r>
+              <w:rPr>
+                <w:rFonts w:ascii="Poppins" w:hAnsi="Poppins" w:cs="Poppins"/>
+                <w:sz w:val="20"/>
+                <w:szCs w:val="20"/>
+              </w:rPr>
+              <w:t xml:space="preserve">Contact Form </w:t>
+            </w:r>
+            <w:proofErr w:type="spellStart"/>
+            <w:r>
+              <w:rPr>
+                <w:rFonts w:ascii="Poppins" w:hAnsi="Poppins" w:cs="Poppins"/>
+                <w:sz w:val="20"/>
+                <w:szCs w:val="20"/>
+              </w:rPr>
+              <w:t>wajib</w:t>
+            </w:r>
+            <w:proofErr w:type="spellEnd"/>
+            <w:r>
+              <w:rPr>
+                <w:rFonts w:ascii="Poppins" w:hAnsi="Poppins" w:cs="Poppins"/>
+                <w:sz w:val="20"/>
+                <w:szCs w:val="20"/>
+              </w:rPr>
+              <w:t xml:space="preserve"> </w:t>
+            </w:r>
+            <w:proofErr w:type="spellStart"/>
+            <w:r>
+              <w:rPr>
+                <w:rFonts w:ascii="Poppins" w:hAnsi="Poppins" w:cs="Poppins"/>
+                <w:sz w:val="20"/>
+                <w:szCs w:val="20"/>
+              </w:rPr>
+              <w:t>validasi</w:t>
+            </w:r>
+            <w:proofErr w:type="spellEnd"/>
+            <w:r>
+              <w:rPr>
+                <w:rFonts w:ascii="Poppins" w:hAnsi="Poppins" w:cs="Poppins"/>
+                <w:sz w:val="20"/>
+                <w:szCs w:val="20"/>
+              </w:rPr>
+              <w:t>.</w:t>
+            </w:r>
+          </w:p>
+          <w:p>
+            <w:pPr>
+              <w:pStyle w:val="ListParagraph"/>
+              <w:numPr>
+                <w:ilvl w:val="0"/>
+                <w:numId w:val="4"/>
+              </w:numPr>
+              <w:jc w:val="both"/>
+              <w:rPr>
+                <w:rFonts w:ascii="Poppins" w:hAnsi="Poppins" w:cs="Poppins"/>
+                <w:sz w:val="20"/>
+                <w:szCs w:val="20"/>
+              </w:rPr>
+            </w:pPr>
+            <w:r>
+              <w:rPr>
+                <w:rFonts w:ascii="Poppins" w:hAnsi="Poppins" w:cs="Poppins"/>
+                <w:sz w:val="20"/>
+                <w:szCs w:val="20"/>
+              </w:rPr>
+              <w:t xml:space="preserve">Project </w:t>
+            </w:r>
+            <w:proofErr w:type="spellStart"/>
+            <w:r>
+              <w:rPr>
+                <w:rFonts w:ascii="Poppins" w:hAnsi="Poppins" w:cs="Poppins"/>
+                <w:sz w:val="20"/>
+                <w:szCs w:val="20"/>
+              </w:rPr>
+              <w:t>harus</w:t>
+            </w:r>
+            <w:proofErr w:type="spellEnd"/>
+            <w:r>
+              <w:rPr>
+                <w:rFonts w:ascii="Poppins" w:hAnsi="Poppins" w:cs="Poppins"/>
+                <w:sz w:val="20"/>
+                <w:szCs w:val="20"/>
+              </w:rPr>
+              <w:t xml:space="preserve"> </w:t>
+            </w:r>
+            <w:proofErr w:type="spellStart"/>
+            <w:r>
+              <w:rPr>
+                <w:rFonts w:ascii="Poppins" w:hAnsi="Poppins" w:cs="Poppins"/>
+                <w:sz w:val="20"/>
+                <w:szCs w:val="20"/>
+              </w:rPr>
+              <w:t>memiliki</w:t>
+            </w:r>
+            <w:proofErr w:type="spellEnd"/>
+            <w:r>
+              <w:rPr>
+                <w:rFonts w:ascii="Poppins" w:hAnsi="Poppins" w:cs="Poppins"/>
+                <w:sz w:val="20"/>
+                <w:szCs w:val="20"/>
+              </w:rPr>
+              <w:t xml:space="preserve"> minimal </w:t>
+            </w:r>
+            <w:proofErr w:type="spellStart"/>
+            <w:r>
+              <w:rPr>
+                <w:rFonts w:ascii="Poppins" w:hAnsi="Poppins" w:cs="Poppins"/>
+                <w:sz w:val="20"/>
+                <w:szCs w:val="20"/>
+              </w:rPr>
+              <w:t>satu</w:t>
+            </w:r>
+            <w:proofErr w:type="spellEnd"/>
+            <w:r>
+              <w:rPr>
+                <w:rFonts w:ascii="Poppins" w:hAnsi="Poppins" w:cs="Poppins"/>
+                <w:sz w:val="20"/>
+                <w:szCs w:val="20"/>
+              </w:rPr>
+              <w:t xml:space="preserve"> thumbnail.</w:t>
+            </w:r>
+          </w:p>
+          <w:p>
+            <w:pPr>
+              <w:pStyle w:val="ListParagraph"/>
+              <w:numPr>
+                <w:ilvl w:val="0"/>
+                <w:numId w:val="4"/>
+              </w:numPr>
+              <w:jc w:val="both"/>
+              <w:rPr>
+                <w:rFonts w:ascii="Poppins" w:hAnsi="Poppins" w:cs="Poppins"/>
+                <w:sz w:val="20"/>
+                <w:szCs w:val="20"/>
+              </w:rPr>
+            </w:pPr>
+            <w:r>
+              <w:rPr>
+                <w:rFonts w:ascii="Poppins" w:hAnsi="Poppins" w:cs="Poppins"/>
+                <w:sz w:val="20"/>
+                <w:szCs w:val="20"/>
+              </w:rPr>
+              <w:t xml:space="preserve">CV </w:t>
+            </w:r>
+            <w:proofErr w:type="spellStart"/>
+            <w:r>
+              <w:rPr>
+                <w:rFonts w:ascii="Poppins" w:hAnsi="Poppins" w:cs="Poppins"/>
+                <w:sz w:val="20"/>
+                <w:szCs w:val="20"/>
+              </w:rPr>
+              <w:t>hanya</w:t>
+            </w:r>
+            <w:proofErr w:type="spellEnd"/>
+            <w:r>
+              <w:rPr>
+                <w:rFonts w:ascii="Poppins" w:hAnsi="Poppins" w:cs="Poppins"/>
+                <w:sz w:val="20"/>
+                <w:szCs w:val="20"/>
+              </w:rPr>
+              <w:t xml:space="preserve"> </w:t>
+            </w:r>
+            <w:proofErr w:type="spellStart"/>
+            <w:r>
+              <w:rPr>
+                <w:rFonts w:ascii="Poppins" w:hAnsi="Poppins" w:cs="Poppins"/>
+                <w:sz w:val="20"/>
+                <w:szCs w:val="20"/>
+              </w:rPr>
+              <w:t>boleh</w:t>
+            </w:r>
+            <w:proofErr w:type="spellEnd"/>
+            <w:r>
+              <w:rPr>
+                <w:rFonts w:ascii="Poppins" w:hAnsi="Poppins" w:cs="Poppins"/>
+                <w:sz w:val="20"/>
+                <w:szCs w:val="20"/>
+              </w:rPr>
+              <w:t xml:space="preserve"> </w:t>
+            </w:r>
+            <w:proofErr w:type="spellStart"/>
+            <w:r>
+              <w:rPr>
+                <w:rFonts w:ascii="Poppins" w:hAnsi="Poppins" w:cs="Poppins"/>
+                <w:sz w:val="20"/>
+                <w:szCs w:val="20"/>
+              </w:rPr>
+              <w:t>satu</w:t>
+            </w:r>
+            <w:proofErr w:type="spellEnd"/>
+            <w:r>
+              <w:rPr>
+                <w:rFonts w:ascii="Poppins" w:hAnsi="Poppins" w:cs="Poppins"/>
+                <w:sz w:val="20"/>
+                <w:szCs w:val="20"/>
+              </w:rPr>
+              <w:t xml:space="preserve"> file </w:t>
+            </w:r>
+            <w:proofErr w:type="spellStart"/>
+            <w:r>
+              <w:rPr>
+                <w:rFonts w:ascii="Poppins" w:hAnsi="Poppins" w:cs="Poppins"/>
+                <w:sz w:val="20"/>
+                <w:szCs w:val="20"/>
+              </w:rPr>
+              <w:t>aktif</w:t>
+            </w:r>
+            <w:proofErr w:type="spellEnd"/>
+            <w:r>
+              <w:rPr>
+                <w:rFonts w:ascii="Poppins" w:hAnsi="Poppins" w:cs="Poppins"/>
+                <w:sz w:val="20"/>
+                <w:szCs w:val="20"/>
+              </w:rPr>
+              <w:t>.</w:t>
+            </w:r>
+          </w:p>
+          <w:p>
+            <w:pPr>
+              <w:pStyle w:val="ListParagraph"/>
+              <w:numPr>
+                <w:ilvl w:val="0"/>
+                <w:numId w:val="4"/>
+              </w:numPr>
+              <w:jc w:val="both"/>
+              <w:rPr>
+                <w:rFonts w:ascii="Poppins" w:hAnsi="Poppins" w:cs="Poppins"/>
+                <w:sz w:val="20"/>
+                <w:szCs w:val="20"/>
+              </w:rPr>
+            </w:pPr>
+            <w:r>
+              <w:rPr>
+                <w:rFonts w:ascii="Poppins" w:hAnsi="Poppins" w:cs="Poppins"/>
+                <w:sz w:val="20"/>
+                <w:szCs w:val="20"/>
+              </w:rPr>
+              <w:t xml:space="preserve">Hero </w:t>
+            </w:r>
+            <w:proofErr w:type="spellStart"/>
+            <w:r>
+              <w:rPr>
+                <w:rFonts w:ascii="Poppins" w:hAnsi="Poppins" w:cs="Poppins"/>
+                <w:sz w:val="20"/>
+                <w:szCs w:val="20"/>
+              </w:rPr>
+              <w:t>hanya</w:t>
+            </w:r>
+            <w:proofErr w:type="spellEnd"/>
+            <w:r>
+              <w:rPr>
+                <w:rFonts w:ascii="Poppins" w:hAnsi="Poppins" w:cs="Poppins"/>
+                <w:sz w:val="20"/>
+                <w:szCs w:val="20"/>
+              </w:rPr>
+              <w:t xml:space="preserve"> </w:t>
+            </w:r>
+            <w:proofErr w:type="spellStart"/>
+            <w:r>
+              <w:rPr>
+                <w:rFonts w:ascii="Poppins" w:hAnsi="Poppins" w:cs="Poppins"/>
+                <w:sz w:val="20"/>
+                <w:szCs w:val="20"/>
+              </w:rPr>
+              <w:t>boleh</w:t>
+            </w:r>
+            <w:proofErr w:type="spellEnd"/>
+            <w:r>
+              <w:rPr>
+                <w:rFonts w:ascii="Poppins" w:hAnsi="Poppins" w:cs="Poppins"/>
+                <w:sz w:val="20"/>
+                <w:szCs w:val="20"/>
+              </w:rPr>
+              <w:t xml:space="preserve"> </w:t>
+            </w:r>
+            <w:proofErr w:type="spellStart"/>
+            <w:r>
+              <w:rPr>
+                <w:rFonts w:ascii="Poppins" w:hAnsi="Poppins" w:cs="Poppins"/>
+                <w:sz w:val="20"/>
+                <w:szCs w:val="20"/>
+              </w:rPr>
+              <w:t>satu</w:t>
+            </w:r>
+            <w:proofErr w:type="spellEnd"/>
+            <w:r>
+              <w:rPr>
+                <w:rFonts w:ascii="Poppins" w:hAnsi="Poppins" w:cs="Poppins"/>
+                <w:sz w:val="20"/>
+                <w:szCs w:val="20"/>
+              </w:rPr>
+              <w:t xml:space="preserve"> data.</w:t>
+            </w:r>
+          </w:p>
+          <w:p>
+            <w:pPr>
+              <w:pStyle w:val="ListParagraph"/>
+              <w:numPr>
+                <w:ilvl w:val="0"/>
+                <w:numId w:val="4"/>
+              </w:numPr>
+              <w:jc w:val="both"/>
+              <w:rPr>
+                <w:rFonts w:ascii="Poppins" w:hAnsi="Poppins" w:cs="Poppins"/>
+                <w:sz w:val="20"/>
+                <w:szCs w:val="20"/>
+              </w:rPr>
+            </w:pPr>
+            <w:r>
+              <w:rPr>
+                <w:rFonts w:ascii="Poppins" w:hAnsi="Poppins" w:cs="Poppins"/>
+                <w:sz w:val="20"/>
+                <w:szCs w:val="20"/>
+              </w:rPr>
+              <w:t xml:space="preserve">About </w:t>
+            </w:r>
+            <w:proofErr w:type="spellStart"/>
+            <w:r>
+              <w:rPr>
+                <w:rFonts w:ascii="Poppins" w:hAnsi="Poppins" w:cs="Poppins"/>
+                <w:sz w:val="20"/>
+                <w:szCs w:val="20"/>
+              </w:rPr>
+              <w:t>hanya</w:t>
+            </w:r>
+            <w:proofErr w:type="spellEnd"/>
+            <w:r>
+              <w:rPr>
+                <w:rFonts w:ascii="Poppins" w:hAnsi="Poppins" w:cs="Poppins"/>
+                <w:sz w:val="20"/>
+                <w:szCs w:val="20"/>
+              </w:rPr>
+              <w:t xml:space="preserve"> </w:t>
+            </w:r>
+            <w:proofErr w:type="spellStart"/>
+            <w:r>
+              <w:rPr>
+                <w:rFonts w:ascii="Poppins" w:hAnsi="Poppins" w:cs="Poppins"/>
+                <w:sz w:val="20"/>
+                <w:szCs w:val="20"/>
+              </w:rPr>
+              <w:t>boleh</w:t>
+            </w:r>
+            <w:proofErr w:type="spellEnd"/>
+            <w:r>
+              <w:rPr>
+                <w:rFonts w:ascii="Poppins" w:hAnsi="Poppins" w:cs="Poppins"/>
+                <w:sz w:val="20"/>
+                <w:szCs w:val="20"/>
+              </w:rPr>
+              <w:t xml:space="preserve"> </w:t>
+            </w:r>
+            <w:proofErr w:type="spellStart"/>
+            <w:r>
+              <w:rPr>
+                <w:rFonts w:ascii="Poppins" w:hAnsi="Poppins" w:cs="Poppins"/>
+                <w:sz w:val="20"/>
+                <w:szCs w:val="20"/>
+              </w:rPr>
+              <w:t>satu</w:t>
+            </w:r>
+            <w:proofErr w:type="spellEnd"/>
+            <w:r>
+              <w:rPr>
+                <w:rFonts w:ascii="Poppins" w:hAnsi="Poppins" w:cs="Poppins"/>
+                <w:sz w:val="20"/>
+                <w:szCs w:val="20"/>
+              </w:rPr>
+              <w:t xml:space="preserve"> data.</w:t>
+            </w:r>
+          </w:p>
+          <w:p>
+            <w:pPr>
+              <w:pStyle w:val="ListParagraph"/>
+              <w:numPr>
+                <w:ilvl w:val="0"/>
+                <w:numId w:val="4"/>
+              </w:numPr>
+              <w:jc w:val="both"/>
+              <w:rPr>
+                <w:rFonts w:ascii="Poppins" w:hAnsi="Poppins" w:cs="Poppins"/>
+                <w:sz w:val="20"/>
+                <w:szCs w:val="20"/>
+              </w:rPr>
+            </w:pPr>
+            <w:r>
+              <w:rPr>
+                <w:rFonts w:ascii="Poppins" w:hAnsi="Poppins" w:cs="Poppins"/>
+                <w:sz w:val="20"/>
+                <w:szCs w:val="20"/>
+              </w:rPr>
+              <w:t xml:space="preserve">Site Setting </w:t>
+            </w:r>
+            <w:proofErr w:type="spellStart"/>
+            <w:r>
+              <w:rPr>
+                <w:rFonts w:ascii="Poppins" w:hAnsi="Poppins" w:cs="Poppins"/>
+                <w:sz w:val="20"/>
+                <w:szCs w:val="20"/>
+              </w:rPr>
+              <w:t>hanya</w:t>
+            </w:r>
+            <w:proofErr w:type="spellEnd"/>
+            <w:r>
+              <w:rPr>
+                <w:rFonts w:ascii="Poppins" w:hAnsi="Poppins" w:cs="Poppins"/>
+                <w:sz w:val="20"/>
+                <w:szCs w:val="20"/>
+              </w:rPr>
+              <w:t xml:space="preserve"> </w:t>
+            </w:r>
+            <w:proofErr w:type="spellStart"/>
+            <w:r>
+              <w:rPr>
+                <w:rFonts w:ascii="Poppins" w:hAnsi="Poppins" w:cs="Poppins"/>
+                <w:sz w:val="20"/>
+                <w:szCs w:val="20"/>
+              </w:rPr>
+              <w:t>satu</w:t>
+            </w:r>
+            <w:proofErr w:type="spellEnd"/>
+            <w:r>
+              <w:rPr>
+                <w:rFonts w:ascii="Poppins" w:hAnsi="Poppins" w:cs="Poppins"/>
+                <w:sz w:val="20"/>
+                <w:szCs w:val="20"/>
+              </w:rPr>
+              <w:t xml:space="preserve"> record.</w:t>
             </w:r>
           </w:p>
         </w:tc>
@@ -1695,50 +2686,6 @@
               <w:t>Platform Cloud (TBD)</w:t>
             </w:r>
           </w:p>
-          <w:p>
-            <w:pPr>
-              <w:jc w:val="both"/>
-              <w:rPr>
-                <w:rFonts w:ascii="Poppins" w:hAnsi="Poppins" w:cs="Poppins"/>
-                <w:sz w:val="20"/>
-                <w:szCs w:val="20"/>
-              </w:rPr>
-            </w:pPr>
-            <w:r>
-              <w:rPr>
-                <w:rFonts w:ascii="Poppins" w:hAnsi="Poppins" w:cs="Poppins"/>
-                <w:sz w:val="20"/>
-                <w:szCs w:val="20"/>
-              </w:rPr>
-              <w:t>CI/</w:t>
-            </w:r>
-            <w:proofErr w:type="gramStart"/>
-            <w:r>
-              <w:rPr>
-                <w:rFonts w:ascii="Poppins" w:hAnsi="Poppins" w:cs="Poppins"/>
-                <w:sz w:val="20"/>
-                <w:szCs w:val="20"/>
-              </w:rPr>
-              <w:t>CD</w:t>
-            </w:r>
-            <w:r>
-              <w:rPr>
-                <w:rFonts w:ascii="Poppins" w:hAnsi="Poppins" w:cs="Poppins"/>
-                <w:sz w:val="20"/>
-                <w:szCs w:val="20"/>
-              </w:rPr>
-              <w:t xml:space="preserve"> :</w:t>
-            </w:r>
-            <w:proofErr w:type="gramEnd"/>
-            <w:r>
-              <w:rPr>
-                <w:rFonts w:ascii="Poppins" w:hAnsi="Poppins" w:cs="Poppins"/>
-                <w:sz w:val="20"/>
-                <w:szCs w:val="20"/>
-              </w:rPr>
-              <w:t xml:space="preserve"> GitHub Actions</w:t>
-            </w:r>
-          </w:p>
         </w:tc>
         <w:tc>
           <w:tcPr>
@@ -1832,6 +2779,357 @@
                 <w:szCs w:val="20"/>
               </w:rPr>
             </w:pPr>
+          </w:p>
+        </w:tc>
+      </w:tr>
+    </w:tbl>
+    <w:p>
+      <w:pPr>
+        <w:pStyle w:val="ListParagraph"/>
+        <w:jc w:val="both"/>
+        <w:rPr>
+          <w:rFonts w:ascii="Poppins" w:hAnsi="Poppins" w:cs="Poppins"/>
+          <w:sz w:val="20"/>
+          <w:szCs w:val="20"/>
+        </w:rPr>
+      </w:pPr>
+    </w:p>
+    <w:p>
+      <w:pPr>
+        <w:pStyle w:val="ListParagraph"/>
+        <w:jc w:val="both"/>
+        <w:rPr>
+          <w:rFonts w:ascii="Poppins" w:hAnsi="Poppins" w:cs="Poppins"/>
+          <w:sz w:val="20"/>
+          <w:szCs w:val="20"/>
+        </w:rPr>
+      </w:pPr>
+      <w:r>
+        <w:rPr>
+          <w:rFonts w:ascii="Poppins" w:hAnsi="Poppins" w:cs="Poppins"/>
+          <w:sz w:val="20"/>
+          <w:szCs w:val="20"/>
+        </w:rPr>
+        <w:t>Constraint</w:t>
+      </w:r>
+      <w:r>
+        <w:rPr>
+          <w:rFonts w:ascii="Poppins" w:hAnsi="Poppins" w:cs="Poppins"/>
+          <w:sz w:val="20"/>
+          <w:szCs w:val="20"/>
+        </w:rPr>
+        <w:br/>
+      </w:r>
+      <w:r>
+        <w:rPr>
+          <w:rFonts w:ascii="Poppins" w:hAnsi="Poppins" w:cs="Poppins"/>
+          <w:sz w:val="20"/>
+          <w:szCs w:val="20"/>
+        </w:rPr>
+        <w:t xml:space="preserve">PHP </w:t>
+      </w:r>
+      <w:proofErr w:type="gramStart"/>
+      <w:r>
+        <w:rPr>
+          <w:rFonts w:ascii="Poppins" w:hAnsi="Poppins" w:cs="Poppins"/>
+          <w:sz w:val="20"/>
+          <w:szCs w:val="20"/>
+        </w:rPr>
+        <w:t>8.2 ,</w:t>
+      </w:r>
+      <w:proofErr w:type="gramEnd"/>
+      <w:r>
+        <w:rPr>
+          <w:rFonts w:ascii="Poppins" w:hAnsi="Poppins" w:cs="Poppins"/>
+          <w:sz w:val="20"/>
+          <w:szCs w:val="20"/>
+        </w:rPr>
+        <w:t xml:space="preserve"> Laravel 12, React 19, Node 24, MySQL 8, Filament 4</w:t>
+      </w:r>
+    </w:p>
+    <w:p>
+      <w:pPr>
+        <w:pStyle w:val="ListParagraph"/>
+        <w:jc w:val="both"/>
+        <w:rPr>
+          <w:rFonts w:ascii="Poppins" w:hAnsi="Poppins" w:cs="Poppins"/>
+          <w:sz w:val="20"/>
+          <w:szCs w:val="20"/>
+        </w:rPr>
+      </w:pPr>
+    </w:p>
+    <w:p>
+      <w:pPr>
+        <w:pStyle w:val="ListParagraph"/>
+        <w:jc w:val="both"/>
+        <w:rPr>
+          <w:rFonts w:ascii="Poppins" w:hAnsi="Poppins" w:cs="Poppins"/>
+          <w:sz w:val="20"/>
+          <w:szCs w:val="20"/>
+        </w:rPr>
+      </w:pPr>
+      <w:r>
+        <w:rPr>
+          <w:rFonts w:ascii="Poppins" w:hAnsi="Poppins" w:cs="Poppins"/>
+          <w:sz w:val="20"/>
+          <w:szCs w:val="20"/>
+        </w:rPr>
+        <w:t>Assumption</w:t>
+      </w:r>
+    </w:p>
+    <w:tbl>
+      <w:tblPr>
+        <w:tblStyle w:val="TableGridLight"/>
+        <w:tblW w:w="9350" w:type="dxa"/>
+        <w:tblInd w:w="679" w:type="dxa"/>
+        <w:tblLook w:val="04A0" w:firstRow="1" w:lastRow="0" w:firstColumn="1" w:lastColumn="0" w:noHBand="0" w:noVBand="1"/>
+      </w:tblPr>
+      <w:tblGrid>
+        <w:gridCol w:w="9350"/>
+      </w:tblGrid>
+      <w:tr>
+        <w:tc>
+          <w:tcPr>
+            <w:tcW w:w="9350" w:type="dxa"/>
+          </w:tcPr>
+          <w:p>
+            <w:pPr>
+              <w:pStyle w:val="ListParagraph"/>
+              <w:numPr>
+                <w:ilvl w:val="0"/>
+                <w:numId w:val="4"/>
+              </w:numPr>
+              <w:jc w:val="both"/>
+              <w:rPr>
+                <w:rFonts w:ascii="Poppins" w:hAnsi="Poppins" w:cs="Poppins"/>
+                <w:sz w:val="20"/>
+                <w:szCs w:val="20"/>
+              </w:rPr>
+            </w:pPr>
+            <w:proofErr w:type="spellStart"/>
+            <w:r>
+              <w:rPr>
+                <w:rFonts w:ascii="Poppins" w:hAnsi="Poppins" w:cs="Poppins"/>
+                <w:sz w:val="20"/>
+                <w:szCs w:val="20"/>
+              </w:rPr>
+              <w:t>Pengunjung</w:t>
+            </w:r>
+            <w:proofErr w:type="spellEnd"/>
+            <w:r>
+              <w:rPr>
+                <w:rFonts w:ascii="Poppins" w:hAnsi="Poppins" w:cs="Poppins"/>
+                <w:sz w:val="20"/>
+                <w:szCs w:val="20"/>
+              </w:rPr>
+              <w:t xml:space="preserve"> </w:t>
+            </w:r>
+            <w:proofErr w:type="spellStart"/>
+            <w:r>
+              <w:rPr>
+                <w:rFonts w:ascii="Poppins" w:hAnsi="Poppins" w:cs="Poppins"/>
+                <w:sz w:val="20"/>
+                <w:szCs w:val="20"/>
+              </w:rPr>
+              <w:t>menggunakan</w:t>
+            </w:r>
+            <w:proofErr w:type="spellEnd"/>
+            <w:r>
+              <w:rPr>
+                <w:rFonts w:ascii="Poppins" w:hAnsi="Poppins" w:cs="Poppins"/>
+                <w:sz w:val="20"/>
+                <w:szCs w:val="20"/>
+              </w:rPr>
+              <w:t xml:space="preserve"> browser modern.</w:t>
+            </w:r>
+          </w:p>
+          <w:p>
+            <w:pPr>
+              <w:pStyle w:val="ListParagraph"/>
+              <w:numPr>
+                <w:ilvl w:val="0"/>
+                <w:numId w:val="4"/>
+              </w:numPr>
+              <w:jc w:val="both"/>
+              <w:rPr>
+                <w:rFonts w:ascii="Poppins" w:hAnsi="Poppins" w:cs="Poppins"/>
+                <w:sz w:val="20"/>
+                <w:szCs w:val="20"/>
+              </w:rPr>
+            </w:pPr>
+            <w:proofErr w:type="spellStart"/>
+            <w:r>
+              <w:rPr>
+                <w:rFonts w:ascii="Poppins" w:hAnsi="Poppins" w:cs="Poppins"/>
+                <w:sz w:val="20"/>
+                <w:szCs w:val="20"/>
+              </w:rPr>
+              <w:t>Koneksi</w:t>
+            </w:r>
+            <w:proofErr w:type="spellEnd"/>
+            <w:r>
+              <w:rPr>
+                <w:rFonts w:ascii="Poppins" w:hAnsi="Poppins" w:cs="Poppins"/>
+                <w:sz w:val="20"/>
+                <w:szCs w:val="20"/>
+              </w:rPr>
+              <w:t xml:space="preserve"> internet </w:t>
+            </w:r>
+            <w:proofErr w:type="spellStart"/>
+            <w:r>
+              <w:rPr>
+                <w:rFonts w:ascii="Poppins" w:hAnsi="Poppins" w:cs="Poppins"/>
+                <w:sz w:val="20"/>
+                <w:szCs w:val="20"/>
+              </w:rPr>
+              <w:t>tersedia</w:t>
+            </w:r>
+            <w:proofErr w:type="spellEnd"/>
+            <w:r>
+              <w:rPr>
+                <w:rFonts w:ascii="Poppins" w:hAnsi="Poppins" w:cs="Poppins"/>
+                <w:sz w:val="20"/>
+                <w:szCs w:val="20"/>
+              </w:rPr>
+              <w:t>.</w:t>
+            </w:r>
+          </w:p>
+          <w:p>
+            <w:pPr>
+              <w:pStyle w:val="ListParagraph"/>
+              <w:numPr>
+                <w:ilvl w:val="0"/>
+                <w:numId w:val="4"/>
+              </w:numPr>
+              <w:jc w:val="both"/>
+              <w:rPr>
+                <w:rFonts w:ascii="Poppins" w:hAnsi="Poppins" w:cs="Poppins"/>
+                <w:sz w:val="20"/>
+                <w:szCs w:val="20"/>
+              </w:rPr>
+            </w:pPr>
+            <w:r>
+              <w:rPr>
+                <w:rFonts w:ascii="Poppins" w:hAnsi="Poppins" w:cs="Poppins"/>
+                <w:sz w:val="20"/>
+                <w:szCs w:val="20"/>
+              </w:rPr>
+              <w:t xml:space="preserve">Admin </w:t>
+            </w:r>
+            <w:proofErr w:type="spellStart"/>
+            <w:r>
+              <w:rPr>
+                <w:rFonts w:ascii="Poppins" w:hAnsi="Poppins" w:cs="Poppins"/>
+                <w:sz w:val="20"/>
+                <w:szCs w:val="20"/>
+              </w:rPr>
+              <w:t>memiliki</w:t>
+            </w:r>
+            <w:proofErr w:type="spellEnd"/>
+            <w:r>
+              <w:rPr>
+                <w:rFonts w:ascii="Poppins" w:hAnsi="Poppins" w:cs="Poppins"/>
+                <w:sz w:val="20"/>
+                <w:szCs w:val="20"/>
+              </w:rPr>
+              <w:t xml:space="preserve"> </w:t>
+            </w:r>
+            <w:proofErr w:type="spellStart"/>
+            <w:r>
+              <w:rPr>
+                <w:rFonts w:ascii="Poppins" w:hAnsi="Poppins" w:cs="Poppins"/>
+                <w:sz w:val="20"/>
+                <w:szCs w:val="20"/>
+              </w:rPr>
+              <w:t>akses</w:t>
+            </w:r>
+            <w:proofErr w:type="spellEnd"/>
+            <w:r>
+              <w:rPr>
+                <w:rFonts w:ascii="Poppins" w:hAnsi="Poppins" w:cs="Poppins"/>
+                <w:sz w:val="20"/>
+                <w:szCs w:val="20"/>
+              </w:rPr>
+              <w:t xml:space="preserve"> dashboard.</w:t>
+            </w:r>
+          </w:p>
+          <w:p>
+            <w:pPr>
+              <w:pStyle w:val="ListParagraph"/>
+              <w:numPr>
+                <w:ilvl w:val="0"/>
+                <w:numId w:val="4"/>
+              </w:numPr>
+              <w:jc w:val="both"/>
+              <w:rPr>
+                <w:rFonts w:ascii="Poppins" w:hAnsi="Poppins" w:cs="Poppins"/>
+                <w:sz w:val="20"/>
+                <w:szCs w:val="20"/>
+              </w:rPr>
+            </w:pPr>
+            <w:r>
+              <w:rPr>
+                <w:rFonts w:ascii="Poppins" w:hAnsi="Poppins" w:cs="Poppins"/>
+                <w:sz w:val="20"/>
+                <w:szCs w:val="20"/>
+              </w:rPr>
+              <w:lastRenderedPageBreak/>
+              <w:t xml:space="preserve">Storage </w:t>
+            </w:r>
+            <w:proofErr w:type="spellStart"/>
+            <w:r>
+              <w:rPr>
+                <w:rFonts w:ascii="Poppins" w:hAnsi="Poppins" w:cs="Poppins"/>
+                <w:sz w:val="20"/>
+                <w:szCs w:val="20"/>
+              </w:rPr>
+              <w:t>cukup</w:t>
+            </w:r>
+            <w:proofErr w:type="spellEnd"/>
+            <w:r>
+              <w:rPr>
+                <w:rFonts w:ascii="Poppins" w:hAnsi="Poppins" w:cs="Poppins"/>
+                <w:sz w:val="20"/>
+                <w:szCs w:val="20"/>
+              </w:rPr>
+              <w:t xml:space="preserve"> </w:t>
+            </w:r>
+            <w:proofErr w:type="spellStart"/>
+            <w:r>
+              <w:rPr>
+                <w:rFonts w:ascii="Poppins" w:hAnsi="Poppins" w:cs="Poppins"/>
+                <w:sz w:val="20"/>
+                <w:szCs w:val="20"/>
+              </w:rPr>
+              <w:t>untuk</w:t>
+            </w:r>
+            <w:proofErr w:type="spellEnd"/>
+            <w:r>
+              <w:rPr>
+                <w:rFonts w:ascii="Poppins" w:hAnsi="Poppins" w:cs="Poppins"/>
+                <w:sz w:val="20"/>
+                <w:szCs w:val="20"/>
+              </w:rPr>
+              <w:t xml:space="preserve"> upload </w:t>
+            </w:r>
+            <w:proofErr w:type="spellStart"/>
+            <w:r>
+              <w:rPr>
+                <w:rFonts w:ascii="Poppins" w:hAnsi="Poppins" w:cs="Poppins"/>
+                <w:sz w:val="20"/>
+                <w:szCs w:val="20"/>
+              </w:rPr>
+              <w:t>gambar</w:t>
+            </w:r>
+            <w:proofErr w:type="spellEnd"/>
+            <w:r>
+              <w:rPr>
+                <w:rFonts w:ascii="Poppins" w:hAnsi="Poppins" w:cs="Poppins"/>
+                <w:sz w:val="20"/>
+                <w:szCs w:val="20"/>
+              </w:rPr>
+              <w:t>.</w:t>
+            </w:r>
           </w:p>
         </w:tc>
       </w:tr>
@@ -2345,34 +3643,14 @@
               </w:rPr>
               <w:t>render/railway/</w:t>
             </w:r>
-            <w:proofErr w:type="spellStart"/>
-            <w:r>
-              <w:rPr>
-                <w:rFonts w:ascii="Poppins" w:hAnsi="Poppins" w:cs="Poppins"/>
-                <w:sz w:val="20"/>
-                <w:szCs w:val="20"/>
-              </w:rPr>
-              <w:t>yg</w:t>
-            </w:r>
-            <w:proofErr w:type="spellEnd"/>
-            <w:r>
-              <w:rPr>
-                <w:rFonts w:ascii="Poppins" w:hAnsi="Poppins" w:cs="Poppins"/>
-                <w:sz w:val="20"/>
-                <w:szCs w:val="20"/>
-              </w:rPr>
-              <w:t xml:space="preserve"> </w:t>
-            </w:r>
-            <w:proofErr w:type="spellStart"/>
-            <w:r>
-              <w:rPr>
-                <w:rFonts w:ascii="Poppins" w:hAnsi="Poppins" w:cs="Poppins"/>
-                <w:sz w:val="20"/>
-                <w:szCs w:val="20"/>
-              </w:rPr>
-              <w:t>gratisan</w:t>
-            </w:r>
-            <w:proofErr w:type="spellEnd"/>
+            <w:r>
+              <w:rPr>
+                <w:rFonts w:ascii="Poppins" w:hAnsi="Poppins" w:cs="Poppins"/>
+                <w:sz w:val="20"/>
+                <w:szCs w:val="20"/>
+              </w:rPr>
+              <w:t>platform.sh</w:t>
+            </w:r>
           </w:p>
           <w:p>
             <w:pPr>
@@ -2908,8 +4186,6 @@
         <w:jc w:val="both"/>
         <w:rPr>
           <w:rFonts w:ascii="Poppins" w:hAnsi="Poppins" w:cs="Poppins"/>
-          <w:b/>
-          <w:bCs/>
           <w:sz w:val="20"/>
           <w:szCs w:val="20"/>
         </w:rPr>
@@ -2921,8 +4197,6 @@
         <w:jc w:val="both"/>
         <w:rPr>
           <w:rFonts w:ascii="Poppins" w:hAnsi="Poppins" w:cs="Poppins"/>
-          <w:b/>
-          <w:bCs/>
           <w:sz w:val="20"/>
           <w:szCs w:val="20"/>
         </w:rPr>
@@ -2934,8 +4208,6 @@
         <w:jc w:val="both"/>
         <w:rPr>
           <w:rFonts w:ascii="Poppins" w:hAnsi="Poppins" w:cs="Poppins"/>
-          <w:b/>
-          <w:bCs/>
           <w:sz w:val="20"/>
           <w:szCs w:val="20"/>
         </w:rPr>
@@ -2947,8 +4219,6 @@
         <w:jc w:val="both"/>
         <w:rPr>
           <w:rFonts w:ascii="Poppins" w:hAnsi="Poppins" w:cs="Poppins"/>
-          <w:b/>
-          <w:bCs/>
           <w:sz w:val="20"/>
           <w:szCs w:val="20"/>
         </w:rPr>
@@ -2960,8 +4230,6 @@
         <w:jc w:val="both"/>
         <w:rPr>
           <w:rFonts w:ascii="Poppins" w:hAnsi="Poppins" w:cs="Poppins"/>
-          <w:b/>
-          <w:bCs/>
           <w:sz w:val="20"/>
           <w:szCs w:val="20"/>
         </w:rPr>
@@ -2973,8 +4241,6 @@
         <w:jc w:val="both"/>
         <w:rPr>
           <w:rFonts w:ascii="Poppins" w:hAnsi="Poppins" w:cs="Poppins"/>
-          <w:b/>
-          <w:bCs/>
           <w:sz w:val="20"/>
           <w:szCs w:val="20"/>
         </w:rPr>
@@ -2986,8 +4252,6 @@
         <w:jc w:val="both"/>
         <w:rPr>
           <w:rFonts w:ascii="Poppins" w:hAnsi="Poppins" w:cs="Poppins"/>
-          <w:b/>
-          <w:bCs/>
           <w:sz w:val="20"/>
           <w:szCs w:val="20"/>
         </w:rPr>
@@ -2999,8 +4263,6 @@
         <w:jc w:val="both"/>
         <w:rPr>
           <w:rFonts w:ascii="Poppins" w:hAnsi="Poppins" w:cs="Poppins"/>
-          <w:b/>
-          <w:bCs/>
           <w:sz w:val="20"/>
           <w:szCs w:val="20"/>
         </w:rPr>
@@ -3012,47 +4274,6 @@
         <w:jc w:val="both"/>
         <w:rPr>
           <w:rFonts w:ascii="Poppins" w:hAnsi="Poppins" w:cs="Poppins"/>
-          <w:b/>
-          <w:bCs/>
-          <w:sz w:val="20"/>
-          <w:szCs w:val="20"/>
-        </w:rPr>
-      </w:pPr>
-    </w:p>
-    <w:p>
-      <w:pPr>
-        <w:pStyle w:val="ListParagraph"/>
-        <w:jc w:val="both"/>
-        <w:rPr>
-          <w:rFonts w:ascii="Poppins" w:hAnsi="Poppins" w:cs="Poppins"/>
-          <w:b/>
-          <w:bCs/>
-          <w:sz w:val="20"/>
-          <w:szCs w:val="20"/>
-        </w:rPr>
-      </w:pPr>
-    </w:p>
-    <w:p>
-      <w:pPr>
-        <w:pStyle w:val="ListParagraph"/>
-        <w:jc w:val="both"/>
-        <w:rPr>
-          <w:rFonts w:ascii="Poppins" w:hAnsi="Poppins" w:cs="Poppins"/>
-          <w:b/>
-          <w:bCs/>
-          <w:sz w:val="20"/>
-          <w:szCs w:val="20"/>
-        </w:rPr>
-      </w:pPr>
-    </w:p>
-    <w:p>
-      <w:pPr>
-        <w:pStyle w:val="ListParagraph"/>
-        <w:jc w:val="both"/>
-        <w:rPr>
-          <w:rFonts w:ascii="Poppins" w:hAnsi="Poppins" w:cs="Poppins"/>
-          <w:b/>
-          <w:bCs/>
           <w:sz w:val="20"/>
           <w:szCs w:val="20"/>
         </w:rPr>
@@ -3082,6 +4303,7 @@
           <w:sz w:val="20"/>
           <w:szCs w:val="20"/>
         </w:rPr>
+        <w:lastRenderedPageBreak/>
         <w:t xml:space="preserve">Database Design (ERD) </w:t>
       </w:r>
     </w:p>
@@ -3118,6 +4340,7 @@
                 <w:rFonts w:ascii="Poppins" w:hAnsi="Poppins" w:cs="Poppins"/>
                 <w:b/>
                 <w:bCs/>
+                <w:noProof/>
                 <w:sz w:val="20"/>
                 <w:szCs w:val="20"/>
               </w:rPr>
@@ -3183,6 +4406,7 @@
                 <w:rFonts w:ascii="Poppins" w:hAnsi="Poppins" w:cs="Poppins"/>
                 <w:b/>
                 <w:bCs/>
+                <w:noProof/>
                 <w:sz w:val="20"/>
                 <w:szCs w:val="20"/>
               </w:rPr>
@@ -3262,6 +4486,7 @@
                 <w:rFonts w:ascii="Poppins" w:hAnsi="Poppins" w:cs="Poppins"/>
                 <w:b/>
                 <w:bCs/>
+                <w:noProof/>
                 <w:sz w:val="20"/>
                 <w:szCs w:val="20"/>
               </w:rPr>
@@ -3382,6 +4607,7 @@
           <w:sz w:val="20"/>
           <w:szCs w:val="20"/>
         </w:rPr>
+        <w:lastRenderedPageBreak/>
         <w:t xml:space="preserve">API Design </w:t>
       </w:r>
     </w:p>
@@ -5291,25 +6517,23 @@
           <w:sz w:val="20"/>
           <w:szCs w:val="20"/>
         </w:rPr>
-        <w:t xml:space="preserve">Planning, Backend, Frontend, Animation, Testing, </w:t>
-      </w:r>
-      <w:proofErr w:type="spellStart"/>
-      <w:r>
-        <w:rPr>
-          <w:rFonts w:ascii="Poppins" w:hAnsi="Poppins" w:cs="Poppins"/>
-          <w:sz w:val="20"/>
-          <w:szCs w:val="20"/>
-        </w:rPr>
-        <w:t>Deploment</w:t>
-      </w:r>
-      <w:proofErr w:type="spellEnd"/>
-      <w:r>
-        <w:rPr>
-          <w:rFonts w:ascii="Poppins" w:hAnsi="Poppins" w:cs="Poppins"/>
-          <w:sz w:val="20"/>
-          <w:szCs w:val="20"/>
-        </w:rPr>
-        <w:t>, CI/CD</w:t>
+        <w:t>Planning, Backend, Frontend, Animation, Testing, Deplo</w:t>
+      </w:r>
+      <w:r>
+        <w:rPr>
+          <w:rFonts w:ascii="Poppins" w:hAnsi="Poppins" w:cs="Poppins"/>
+          <w:sz w:val="20"/>
+          <w:szCs w:val="20"/>
+        </w:rPr>
+        <w:t>y</w:t>
+      </w:r>
+      <w:r>
+        <w:rPr>
+          <w:rFonts w:ascii="Poppins" w:hAnsi="Poppins" w:cs="Poppins"/>
+          <w:sz w:val="20"/>
+          <w:szCs w:val="20"/>
+        </w:rPr>
+        <w:t>ment, CI/CD</w:t>
       </w:r>
     </w:p>
     <w:p>
@@ -5432,17 +6656,6 @@
                 <w:szCs w:val="20"/>
               </w:rPr>
             </w:pPr>
-          </w:p>
-          <w:p>
-            <w:pPr>
-              <w:pStyle w:val="ListParagraph"/>
-              <w:jc w:val="both"/>
-              <w:rPr>
-                <w:rFonts w:ascii="Poppins" w:hAnsi="Poppins" w:cs="Poppins"/>
-                <w:sz w:val="20"/>
-                <w:szCs w:val="20"/>
-              </w:rPr>
-            </w:pPr>
             <w:r>
               <w:rPr>
                 <w:rFonts w:ascii="Poppins" w:hAnsi="Poppins" w:cs="Poppins"/>
@@ -5468,104 +6681,82 @@
                 <w:sz w:val="20"/>
                 <w:szCs w:val="20"/>
               </w:rPr>
+              <w:t xml:space="preserve">- TBD (Render / Railway / Platform Gratis </w:t>
+            </w:r>
+            <w:proofErr w:type="spellStart"/>
+            <w:r>
+              <w:rPr>
+                <w:rFonts w:ascii="Poppins" w:hAnsi="Poppins" w:cs="Poppins"/>
+                <w:sz w:val="20"/>
+                <w:szCs w:val="20"/>
+              </w:rPr>
+              <w:t>lainnya</w:t>
+            </w:r>
+            <w:proofErr w:type="spellEnd"/>
+            <w:r>
+              <w:rPr>
+                <w:rFonts w:ascii="Poppins" w:hAnsi="Poppins" w:cs="Poppins"/>
+                <w:sz w:val="20"/>
+                <w:szCs w:val="20"/>
+              </w:rPr>
+              <w:t>)</w:t>
+            </w:r>
+          </w:p>
+          <w:p>
+            <w:pPr>
+              <w:pStyle w:val="ListParagraph"/>
+              <w:jc w:val="both"/>
+              <w:rPr>
+                <w:rFonts w:ascii="Poppins" w:hAnsi="Poppins" w:cs="Poppins"/>
+                <w:sz w:val="20"/>
+                <w:szCs w:val="20"/>
+              </w:rPr>
+            </w:pPr>
+            <w:r>
+              <w:rPr>
+                <w:rFonts w:ascii="Poppins" w:hAnsi="Poppins" w:cs="Poppins"/>
+                <w:sz w:val="20"/>
+                <w:szCs w:val="20"/>
+              </w:rPr>
+              <w:t>Database</w:t>
+            </w:r>
+          </w:p>
+          <w:p>
+            <w:pPr>
+              <w:pStyle w:val="ListParagraph"/>
+              <w:jc w:val="both"/>
+              <w:rPr>
+                <w:rFonts w:ascii="Poppins" w:hAnsi="Poppins" w:cs="Poppins"/>
+                <w:sz w:val="20"/>
+                <w:szCs w:val="20"/>
+              </w:rPr>
+            </w:pPr>
+            <w:r>
+              <w:rPr>
+                <w:rFonts w:ascii="Poppins" w:hAnsi="Poppins" w:cs="Poppins"/>
+                <w:sz w:val="20"/>
+                <w:szCs w:val="20"/>
+              </w:rPr>
+              <w:t>- TBD (MySQL / PostgreSQL)</w:t>
+            </w:r>
+          </w:p>
+          <w:p>
+            <w:pPr>
+              <w:pStyle w:val="ListParagraph"/>
+              <w:jc w:val="both"/>
+              <w:rPr>
+                <w:rFonts w:ascii="Poppins" w:hAnsi="Poppins" w:cs="Poppins"/>
+                <w:sz w:val="20"/>
+                <w:szCs w:val="20"/>
+              </w:rPr>
+            </w:pPr>
+            <w:r>
+              <w:rPr>
+                <w:rFonts w:ascii="Poppins" w:hAnsi="Poppins" w:cs="Poppins"/>
+                <w:sz w:val="20"/>
+                <w:szCs w:val="20"/>
+              </w:rPr>
               <w:lastRenderedPageBreak/>
-              <w:t xml:space="preserve">- TBD (Render / Railway / Platform Gratis </w:t>
-            </w:r>
-            <w:proofErr w:type="spellStart"/>
-            <w:r>
-              <w:rPr>
-                <w:rFonts w:ascii="Poppins" w:hAnsi="Poppins" w:cs="Poppins"/>
-                <w:sz w:val="20"/>
-                <w:szCs w:val="20"/>
-              </w:rPr>
-              <w:t>lainnya</w:t>
-            </w:r>
-            <w:proofErr w:type="spellEnd"/>
-            <w:r>
-              <w:rPr>
-                <w:rFonts w:ascii="Poppins" w:hAnsi="Poppins" w:cs="Poppins"/>
-                <w:sz w:val="20"/>
-                <w:szCs w:val="20"/>
-              </w:rPr>
-              <w:t>)</w:t>
-            </w:r>
-          </w:p>
-          <w:p>
-            <w:pPr>
-              <w:pStyle w:val="ListParagraph"/>
-              <w:jc w:val="both"/>
-              <w:rPr>
-                <w:rFonts w:ascii="Poppins" w:hAnsi="Poppins" w:cs="Poppins"/>
-                <w:sz w:val="20"/>
-                <w:szCs w:val="20"/>
-              </w:rPr>
-            </w:pPr>
-          </w:p>
-          <w:p>
-            <w:pPr>
-              <w:pStyle w:val="ListParagraph"/>
-              <w:jc w:val="both"/>
-              <w:rPr>
-                <w:rFonts w:ascii="Poppins" w:hAnsi="Poppins" w:cs="Poppins"/>
-                <w:sz w:val="20"/>
-                <w:szCs w:val="20"/>
-              </w:rPr>
-            </w:pPr>
-            <w:r>
-              <w:rPr>
-                <w:rFonts w:ascii="Poppins" w:hAnsi="Poppins" w:cs="Poppins"/>
-                <w:sz w:val="20"/>
-                <w:szCs w:val="20"/>
-              </w:rPr>
-              <w:t>Database</w:t>
-            </w:r>
-          </w:p>
-          <w:p>
-            <w:pPr>
-              <w:pStyle w:val="ListParagraph"/>
-              <w:jc w:val="both"/>
-              <w:rPr>
-                <w:rFonts w:ascii="Poppins" w:hAnsi="Poppins" w:cs="Poppins"/>
-                <w:sz w:val="20"/>
-                <w:szCs w:val="20"/>
-              </w:rPr>
-            </w:pPr>
-            <w:r>
-              <w:rPr>
-                <w:rFonts w:ascii="Poppins" w:hAnsi="Poppins" w:cs="Poppins"/>
-                <w:sz w:val="20"/>
-                <w:szCs w:val="20"/>
-              </w:rPr>
-              <w:t>- TBD (MySQL / PostgreSQL)</w:t>
-            </w:r>
-          </w:p>
-          <w:p>
-            <w:pPr>
-              <w:pStyle w:val="ListParagraph"/>
-              <w:jc w:val="both"/>
-              <w:rPr>
-                <w:rFonts w:ascii="Poppins" w:hAnsi="Poppins" w:cs="Poppins"/>
-                <w:sz w:val="20"/>
-                <w:szCs w:val="20"/>
-              </w:rPr>
-            </w:pPr>
-          </w:p>
-          <w:p>
-            <w:pPr>
-              <w:pStyle w:val="ListParagraph"/>
-              <w:jc w:val="both"/>
-              <w:rPr>
-                <w:rFonts w:ascii="Poppins" w:hAnsi="Poppins" w:cs="Poppins"/>
-                <w:sz w:val="20"/>
-                <w:szCs w:val="20"/>
-              </w:rPr>
-            </w:pPr>
-            <w:r>
-              <w:rPr>
-                <w:rFonts w:ascii="Poppins" w:hAnsi="Poppins" w:cs="Poppins"/>
-                <w:sz w:val="20"/>
-                <w:szCs w:val="20"/>
-              </w:rPr>
               <w:t>DNS</w:t>
             </w:r>
           </w:p>
@@ -5587,17 +6778,6 @@
               </w:rPr>
               <w:t>- Cloudflare</w:t>
             </w:r>
-          </w:p>
-          <w:p>
-            <w:pPr>
-              <w:pStyle w:val="ListParagraph"/>
-              <w:jc w:val="both"/>
-              <w:rPr>
-                <w:rFonts w:ascii="Poppins" w:hAnsi="Poppins" w:cs="Poppins"/>
-                <w:sz w:val="20"/>
-                <w:szCs w:val="20"/>
-              </w:rPr>
-            </w:pPr>
           </w:p>
           <w:p>
             <w:pPr>
@@ -6235,7 +7415,6 @@
           <w:sz w:val="20"/>
           <w:szCs w:val="20"/>
         </w:rPr>
-        <w:lastRenderedPageBreak/>
         <w:t>HTTPS</w:t>
       </w:r>
     </w:p>
@@ -6349,6 +7528,7 @@
           <w:sz w:val="20"/>
           <w:szCs w:val="20"/>
         </w:rPr>
+        <w:lastRenderedPageBreak/>
         <w:t>CSRF (</w:t>
       </w:r>
       <w:proofErr w:type="spellStart"/>
@@ -6635,8 +7815,9 @@
           <w:szCs w:val="20"/>
           <w14:ligatures w14:val="none"/>
         </w:rPr>
-        <w:t xml:space="preserve">Mode </w:t>
-      </w:r>
+        <w:t>Mode ,</w:t>
+      </w:r>
+      <w:proofErr w:type="gramEnd"/>
       <w:r>
         <w:rPr>
           <w:rFonts w:ascii="Poppins" w:eastAsia="Times New Roman" w:hAnsi="Poppins" w:cs="Poppins"/>
@@ -6645,9 +7826,9 @@
           <w:szCs w:val="20"/>
           <w14:ligatures w14:val="none"/>
         </w:rPr>
-        <w:t>,</w:t>
-      </w:r>
-      <w:proofErr w:type="gramEnd"/>
+        <w:t xml:space="preserve"> </w:t>
+      </w:r>
+      <w:proofErr w:type="gramStart"/>
       <w:r>
         <w:rPr>
           <w:rFonts w:ascii="Poppins" w:eastAsia="Times New Roman" w:hAnsi="Poppins" w:cs="Poppins"/>
@@ -6656,9 +7837,9 @@
           <w:szCs w:val="20"/>
           <w14:ligatures w14:val="none"/>
         </w:rPr>
-        <w:t xml:space="preserve"> </w:t>
-      </w:r>
-      <w:proofErr w:type="gramStart"/>
+        <w:t>Blog ,</w:t>
+      </w:r>
+      <w:proofErr w:type="gramEnd"/>
       <w:r>
         <w:rPr>
           <w:rFonts w:ascii="Poppins" w:eastAsia="Times New Roman" w:hAnsi="Poppins" w:cs="Poppins"/>
@@ -6667,8 +7848,9 @@
           <w:szCs w:val="20"/>
           <w14:ligatures w14:val="none"/>
         </w:rPr>
-        <w:t xml:space="preserve">Blog </w:t>
-      </w:r>
+        <w:t xml:space="preserve"> Visitor </w:t>
+      </w:r>
+      <w:proofErr w:type="gramStart"/>
       <w:r>
         <w:rPr>
           <w:rFonts w:ascii="Poppins" w:eastAsia="Times New Roman" w:hAnsi="Poppins" w:cs="Poppins"/>
@@ -6677,7 +7859,7 @@
           <w:szCs w:val="20"/>
           <w14:ligatures w14:val="none"/>
         </w:rPr>
-        <w:t>,</w:t>
+        <w:t>Counter ,</w:t>
       </w:r>
       <w:proofErr w:type="gramEnd"/>
       <w:r>
@@ -6688,8 +7870,9 @@
           <w:szCs w:val="20"/>
           <w14:ligatures w14:val="none"/>
         </w:rPr>
-        <w:t xml:space="preserve"> </w:t>
-      </w:r>
+        <w:t xml:space="preserve"> GitHub Contribution </w:t>
+      </w:r>
+      <w:proofErr w:type="gramStart"/>
       <w:r>
         <w:rPr>
           <w:rFonts w:ascii="Poppins" w:eastAsia="Times New Roman" w:hAnsi="Poppins" w:cs="Poppins"/>
@@ -6698,9 +7881,9 @@
           <w:szCs w:val="20"/>
           <w14:ligatures w14:val="none"/>
         </w:rPr>
-        <w:t xml:space="preserve">Visitor </w:t>
-      </w:r>
-      <w:proofErr w:type="gramStart"/>
+        <w:t>Graph ,</w:t>
+      </w:r>
+      <w:proofErr w:type="gramEnd"/>
       <w:r>
         <w:rPr>
           <w:rFonts w:ascii="Poppins" w:eastAsia="Times New Roman" w:hAnsi="Poppins" w:cs="Poppins"/>
@@ -6709,8 +7892,9 @@
           <w:szCs w:val="20"/>
           <w14:ligatures w14:val="none"/>
         </w:rPr>
-        <w:t xml:space="preserve">Counter </w:t>
-      </w:r>
+        <w:t xml:space="preserve"> Analytics </w:t>
+      </w:r>
+      <w:proofErr w:type="gramStart"/>
       <w:r>
         <w:rPr>
           <w:rFonts w:ascii="Poppins" w:eastAsia="Times New Roman" w:hAnsi="Poppins" w:cs="Poppins"/>
@@ -6719,7 +7903,7 @@
           <w:szCs w:val="20"/>
           <w14:ligatures w14:val="none"/>
         </w:rPr>
-        <w:t>,</w:t>
+        <w:t>Dashboard ,</w:t>
       </w:r>
       <w:proofErr w:type="gramEnd"/>
       <w:r>
@@ -6730,8 +7914,9 @@
           <w:szCs w:val="20"/>
           <w14:ligatures w14:val="none"/>
         </w:rPr>
-        <w:t xml:space="preserve"> </w:t>
-      </w:r>
+        <w:t xml:space="preserve"> Multi </w:t>
+      </w:r>
+      <w:proofErr w:type="gramStart"/>
       <w:r>
         <w:rPr>
           <w:rFonts w:ascii="Poppins" w:eastAsia="Times New Roman" w:hAnsi="Poppins" w:cs="Poppins"/>
@@ -6740,9 +7925,9 @@
           <w:szCs w:val="20"/>
           <w14:ligatures w14:val="none"/>
         </w:rPr>
-        <w:t xml:space="preserve">GitHub Contribution </w:t>
-      </w:r>
-      <w:proofErr w:type="gramStart"/>
+        <w:t>Language ,</w:t>
+      </w:r>
+      <w:proofErr w:type="gramEnd"/>
       <w:r>
         <w:rPr>
           <w:rFonts w:ascii="Poppins" w:eastAsia="Times New Roman" w:hAnsi="Poppins" w:cs="Poppins"/>
@@ -6751,8 +7936,9 @@
           <w:szCs w:val="20"/>
           <w14:ligatures w14:val="none"/>
         </w:rPr>
-        <w:t xml:space="preserve">Graph </w:t>
-      </w:r>
+        <w:t xml:space="preserve"> Download </w:t>
+      </w:r>
+      <w:proofErr w:type="gramStart"/>
       <w:r>
         <w:rPr>
           <w:rFonts w:ascii="Poppins" w:eastAsia="Times New Roman" w:hAnsi="Poppins" w:cs="Poppins"/>
@@ -6761,7 +7947,7 @@
           <w:szCs w:val="20"/>
           <w14:ligatures w14:val="none"/>
         </w:rPr>
-        <w:t>,</w:t>
+        <w:t>Counter ,</w:t>
       </w:r>
       <w:proofErr w:type="gramEnd"/>
       <w:r>
@@ -6772,8 +7958,9 @@
           <w:szCs w:val="20"/>
           <w14:ligatures w14:val="none"/>
         </w:rPr>
-        <w:t xml:space="preserve"> </w:t>
-      </w:r>
+        <w:t xml:space="preserve"> Project </w:t>
+      </w:r>
+      <w:proofErr w:type="gramStart"/>
       <w:r>
         <w:rPr>
           <w:rFonts w:ascii="Poppins" w:eastAsia="Times New Roman" w:hAnsi="Poppins" w:cs="Poppins"/>
@@ -6782,9 +7969,9 @@
           <w:szCs w:val="20"/>
           <w14:ligatures w14:val="none"/>
         </w:rPr>
-        <w:t xml:space="preserve">Analytics </w:t>
-      </w:r>
-      <w:proofErr w:type="gramStart"/>
+        <w:t>Search ,</w:t>
+      </w:r>
+      <w:proofErr w:type="gramEnd"/>
       <w:r>
         <w:rPr>
           <w:rFonts w:ascii="Poppins" w:eastAsia="Times New Roman" w:hAnsi="Poppins" w:cs="Poppins"/>
@@ -6793,8 +7980,9 @@
           <w:szCs w:val="20"/>
           <w14:ligatures w14:val="none"/>
         </w:rPr>
-        <w:t xml:space="preserve">Dashboard </w:t>
-      </w:r>
+        <w:t xml:space="preserve"> Filtering </w:t>
+      </w:r>
+      <w:proofErr w:type="gramStart"/>
       <w:r>
         <w:rPr>
           <w:rFonts w:ascii="Poppins" w:eastAsia="Times New Roman" w:hAnsi="Poppins" w:cs="Poppins"/>
@@ -6803,7 +7991,7 @@
           <w:szCs w:val="20"/>
           <w14:ligatures w14:val="none"/>
         </w:rPr>
-        <w:t>,</w:t>
+        <w:t>Project ,</w:t>
       </w:r>
       <w:proofErr w:type="gramEnd"/>
       <w:r>
@@ -6816,6 +8004,7 @@
         </w:rPr>
         <w:t xml:space="preserve"> </w:t>
       </w:r>
+      <w:proofErr w:type="gramStart"/>
       <w:r>
         <w:rPr>
           <w:rFonts w:ascii="Poppins" w:eastAsia="Times New Roman" w:hAnsi="Poppins" w:cs="Poppins"/>
@@ -6824,9 +8013,9 @@
           <w:szCs w:val="20"/>
           <w14:ligatures w14:val="none"/>
         </w:rPr>
-        <w:t xml:space="preserve">Multi </w:t>
-      </w:r>
-      <w:proofErr w:type="gramStart"/>
+        <w:t>Docker ,</w:t>
+      </w:r>
+      <w:proofErr w:type="gramEnd"/>
       <w:r>
         <w:rPr>
           <w:rFonts w:ascii="Poppins" w:eastAsia="Times New Roman" w:hAnsi="Poppins" w:cs="Poppins"/>
@@ -6835,196 +8024,7 @@
           <w:szCs w:val="20"/>
           <w14:ligatures w14:val="none"/>
         </w:rPr>
-        <w:t xml:space="preserve">Language </w:t>
-      </w:r>
-      <w:r>
-        <w:rPr>
-          <w:rFonts w:ascii="Poppins" w:eastAsia="Times New Roman" w:hAnsi="Poppins" w:cs="Poppins"/>
-          <w:kern w:val="0"/>
-          <w:sz w:val="20"/>
-          <w:szCs w:val="20"/>
-          <w14:ligatures w14:val="none"/>
-        </w:rPr>
-        <w:t>,</w:t>
-      </w:r>
-      <w:proofErr w:type="gramEnd"/>
-      <w:r>
-        <w:rPr>
-          <w:rFonts w:ascii="Poppins" w:eastAsia="Times New Roman" w:hAnsi="Poppins" w:cs="Poppins"/>
-          <w:kern w:val="0"/>
-          <w:sz w:val="20"/>
-          <w:szCs w:val="20"/>
-          <w14:ligatures w14:val="none"/>
-        </w:rPr>
-        <w:t xml:space="preserve"> </w:t>
-      </w:r>
-      <w:r>
-        <w:rPr>
-          <w:rFonts w:ascii="Poppins" w:eastAsia="Times New Roman" w:hAnsi="Poppins" w:cs="Poppins"/>
-          <w:kern w:val="0"/>
-          <w:sz w:val="20"/>
-          <w:szCs w:val="20"/>
-          <w14:ligatures w14:val="none"/>
-        </w:rPr>
-        <w:t xml:space="preserve">Download </w:t>
-      </w:r>
-      <w:proofErr w:type="gramStart"/>
-      <w:r>
-        <w:rPr>
-          <w:rFonts w:ascii="Poppins" w:eastAsia="Times New Roman" w:hAnsi="Poppins" w:cs="Poppins"/>
-          <w:kern w:val="0"/>
-          <w:sz w:val="20"/>
-          <w:szCs w:val="20"/>
-          <w14:ligatures w14:val="none"/>
-        </w:rPr>
-        <w:t xml:space="preserve">Counter </w:t>
-      </w:r>
-      <w:r>
-        <w:rPr>
-          <w:rFonts w:ascii="Poppins" w:eastAsia="Times New Roman" w:hAnsi="Poppins" w:cs="Poppins"/>
-          <w:kern w:val="0"/>
-          <w:sz w:val="20"/>
-          <w:szCs w:val="20"/>
-          <w14:ligatures w14:val="none"/>
-        </w:rPr>
-        <w:t>,</w:t>
-      </w:r>
-      <w:proofErr w:type="gramEnd"/>
-      <w:r>
-        <w:rPr>
-          <w:rFonts w:ascii="Poppins" w:eastAsia="Times New Roman" w:hAnsi="Poppins" w:cs="Poppins"/>
-          <w:kern w:val="0"/>
-          <w:sz w:val="20"/>
-          <w:szCs w:val="20"/>
-          <w14:ligatures w14:val="none"/>
-        </w:rPr>
-        <w:t xml:space="preserve"> </w:t>
-      </w:r>
-      <w:r>
-        <w:rPr>
-          <w:rFonts w:ascii="Poppins" w:eastAsia="Times New Roman" w:hAnsi="Poppins" w:cs="Poppins"/>
-          <w:kern w:val="0"/>
-          <w:sz w:val="20"/>
-          <w:szCs w:val="20"/>
-          <w14:ligatures w14:val="none"/>
-        </w:rPr>
-        <w:t xml:space="preserve">Project </w:t>
-      </w:r>
-      <w:proofErr w:type="gramStart"/>
-      <w:r>
-        <w:rPr>
-          <w:rFonts w:ascii="Poppins" w:eastAsia="Times New Roman" w:hAnsi="Poppins" w:cs="Poppins"/>
-          <w:kern w:val="0"/>
-          <w:sz w:val="20"/>
-          <w:szCs w:val="20"/>
-          <w14:ligatures w14:val="none"/>
-        </w:rPr>
-        <w:t xml:space="preserve">Search </w:t>
-      </w:r>
-      <w:r>
-        <w:rPr>
-          <w:rFonts w:ascii="Poppins" w:eastAsia="Times New Roman" w:hAnsi="Poppins" w:cs="Poppins"/>
-          <w:kern w:val="0"/>
-          <w:sz w:val="20"/>
-          <w:szCs w:val="20"/>
-          <w14:ligatures w14:val="none"/>
-        </w:rPr>
-        <w:t>,</w:t>
-      </w:r>
-      <w:proofErr w:type="gramEnd"/>
-      <w:r>
-        <w:rPr>
-          <w:rFonts w:ascii="Poppins" w:eastAsia="Times New Roman" w:hAnsi="Poppins" w:cs="Poppins"/>
-          <w:kern w:val="0"/>
-          <w:sz w:val="20"/>
-          <w:szCs w:val="20"/>
-          <w14:ligatures w14:val="none"/>
-        </w:rPr>
-        <w:t xml:space="preserve"> </w:t>
-      </w:r>
-      <w:r>
-        <w:rPr>
-          <w:rFonts w:ascii="Poppins" w:eastAsia="Times New Roman" w:hAnsi="Poppins" w:cs="Poppins"/>
-          <w:kern w:val="0"/>
-          <w:sz w:val="20"/>
-          <w:szCs w:val="20"/>
-          <w14:ligatures w14:val="none"/>
-        </w:rPr>
-        <w:t xml:space="preserve">Filtering </w:t>
-      </w:r>
-      <w:proofErr w:type="gramStart"/>
-      <w:r>
-        <w:rPr>
-          <w:rFonts w:ascii="Poppins" w:eastAsia="Times New Roman" w:hAnsi="Poppins" w:cs="Poppins"/>
-          <w:kern w:val="0"/>
-          <w:sz w:val="20"/>
-          <w:szCs w:val="20"/>
-          <w14:ligatures w14:val="none"/>
-        </w:rPr>
-        <w:t xml:space="preserve">Project </w:t>
-      </w:r>
-      <w:r>
-        <w:rPr>
-          <w:rFonts w:ascii="Poppins" w:eastAsia="Times New Roman" w:hAnsi="Poppins" w:cs="Poppins"/>
-          <w:kern w:val="0"/>
-          <w:sz w:val="20"/>
-          <w:szCs w:val="20"/>
-          <w14:ligatures w14:val="none"/>
-        </w:rPr>
-        <w:t>,</w:t>
-      </w:r>
-      <w:proofErr w:type="gramEnd"/>
-      <w:r>
-        <w:rPr>
-          <w:rFonts w:ascii="Poppins" w:eastAsia="Times New Roman" w:hAnsi="Poppins" w:cs="Poppins"/>
-          <w:kern w:val="0"/>
-          <w:sz w:val="20"/>
-          <w:szCs w:val="20"/>
-          <w14:ligatures w14:val="none"/>
-        </w:rPr>
-        <w:t xml:space="preserve"> </w:t>
-      </w:r>
-      <w:proofErr w:type="gramStart"/>
-      <w:r>
-        <w:rPr>
-          <w:rFonts w:ascii="Poppins" w:eastAsia="Times New Roman" w:hAnsi="Poppins" w:cs="Poppins"/>
-          <w:kern w:val="0"/>
-          <w:sz w:val="20"/>
-          <w:szCs w:val="20"/>
-          <w14:ligatures w14:val="none"/>
-        </w:rPr>
-        <w:t xml:space="preserve">Docker </w:t>
-      </w:r>
-      <w:r>
-        <w:rPr>
-          <w:rFonts w:ascii="Poppins" w:eastAsia="Times New Roman" w:hAnsi="Poppins" w:cs="Poppins"/>
-          <w:kern w:val="0"/>
-          <w:sz w:val="20"/>
-          <w:szCs w:val="20"/>
-          <w14:ligatures w14:val="none"/>
-        </w:rPr>
-        <w:t>,</w:t>
-      </w:r>
-      <w:proofErr w:type="gramEnd"/>
-      <w:r>
-        <w:rPr>
-          <w:rFonts w:ascii="Poppins" w:eastAsia="Times New Roman" w:hAnsi="Poppins" w:cs="Poppins"/>
-          <w:kern w:val="0"/>
-          <w:sz w:val="20"/>
-          <w:szCs w:val="20"/>
-          <w14:ligatures w14:val="none"/>
-        </w:rPr>
-        <w:t xml:space="preserve"> </w:t>
-      </w:r>
-      <w:r>
-        <w:rPr>
-          <w:rFonts w:ascii="Poppins" w:eastAsia="Times New Roman" w:hAnsi="Poppins" w:cs="Poppins"/>
-          <w:kern w:val="0"/>
-          <w:sz w:val="20"/>
-          <w:szCs w:val="20"/>
-          <w14:ligatures w14:val="none"/>
-        </w:rPr>
-        <w:t>Redis Cache</w:t>
+        <w:t xml:space="preserve"> Redis Cache</w:t>
       </w:r>
     </w:p>
     <w:p>
@@ -7239,120 +8239,35 @@
           <w:sz w:val="20"/>
           <w:szCs w:val="20"/>
         </w:rPr>
-        <w:t>CRUD API</w:t>
-      </w:r>
-      <w:r>
-        <w:rPr>
-          <w:rFonts w:ascii="Poppins" w:hAnsi="Poppins" w:cs="Poppins"/>
-          <w:sz w:val="20"/>
-          <w:szCs w:val="20"/>
-        </w:rPr>
-        <w:t xml:space="preserve"> -&gt; </w:t>
-      </w:r>
-      <w:r>
-        <w:rPr>
-          <w:rFonts w:ascii="Poppins" w:hAnsi="Poppins" w:cs="Poppins"/>
-          <w:sz w:val="20"/>
-          <w:szCs w:val="20"/>
-        </w:rPr>
-        <w:t>React Consume API</w:t>
-      </w:r>
-      <w:r>
-        <w:rPr>
-          <w:rFonts w:ascii="Poppins" w:hAnsi="Poppins" w:cs="Poppins"/>
-          <w:sz w:val="20"/>
-          <w:szCs w:val="20"/>
-        </w:rPr>
-        <w:t xml:space="preserve"> -&gt; </w:t>
-      </w:r>
-      <w:r>
-        <w:rPr>
-          <w:rFonts w:ascii="Poppins" w:hAnsi="Poppins" w:cs="Poppins"/>
-          <w:sz w:val="20"/>
-          <w:szCs w:val="20"/>
-        </w:rPr>
-        <w:t>GSAP Animation</w:t>
-      </w:r>
-      <w:r>
-        <w:rPr>
-          <w:rFonts w:ascii="Poppins" w:hAnsi="Poppins" w:cs="Poppins"/>
-          <w:sz w:val="20"/>
-          <w:szCs w:val="20"/>
-        </w:rPr>
-        <w:t xml:space="preserve"> -&gt; </w:t>
-      </w:r>
-      <w:r>
-        <w:rPr>
-          <w:rFonts w:ascii="Poppins" w:hAnsi="Poppins" w:cs="Poppins"/>
-          <w:sz w:val="20"/>
-          <w:szCs w:val="20"/>
-        </w:rPr>
-        <w:t>Contact SMTP</w:t>
-      </w:r>
-      <w:r>
-        <w:rPr>
-          <w:rFonts w:ascii="Poppins" w:hAnsi="Poppins" w:cs="Poppins"/>
-          <w:sz w:val="20"/>
-          <w:szCs w:val="20"/>
-        </w:rPr>
-        <w:t xml:space="preserve"> -&gt; </w:t>
-      </w:r>
-      <w:r>
-        <w:rPr>
-          <w:rFonts w:ascii="Poppins" w:hAnsi="Poppins" w:cs="Poppins"/>
-          <w:sz w:val="20"/>
-          <w:szCs w:val="20"/>
-        </w:rPr>
-        <w:t>Download CV</w:t>
-      </w:r>
-      <w:r>
-        <w:rPr>
-          <w:rFonts w:ascii="Poppins" w:hAnsi="Poppins" w:cs="Poppins"/>
-          <w:sz w:val="20"/>
-          <w:szCs w:val="20"/>
-        </w:rPr>
-        <w:t xml:space="preserve"> -&gt; </w:t>
-      </w:r>
-      <w:r>
-        <w:rPr>
-          <w:rFonts w:ascii="Poppins" w:hAnsi="Poppins" w:cs="Poppins"/>
-          <w:sz w:val="20"/>
-          <w:szCs w:val="20"/>
-        </w:rPr>
-        <w:t>Testing</w:t>
-      </w:r>
-      <w:r>
-        <w:rPr>
-          <w:rFonts w:ascii="Poppins" w:hAnsi="Poppins" w:cs="Poppins"/>
-          <w:sz w:val="20"/>
-          <w:szCs w:val="20"/>
-        </w:rPr>
-        <w:t xml:space="preserve"> -&gt; </w:t>
-      </w:r>
-      <w:r>
-        <w:rPr>
-          <w:rFonts w:ascii="Poppins" w:hAnsi="Poppins" w:cs="Poppins"/>
-          <w:sz w:val="20"/>
-          <w:szCs w:val="20"/>
-        </w:rPr>
-        <w:t>Deploy</w:t>
-      </w:r>
-      <w:r>
-        <w:rPr>
-          <w:rFonts w:ascii="Poppins" w:hAnsi="Poppins" w:cs="Poppins"/>
-          <w:sz w:val="20"/>
-          <w:szCs w:val="20"/>
-        </w:rPr>
-        <w:t xml:space="preserve"> -&gt; </w:t>
-      </w:r>
-      <w:r>
-        <w:rPr>
-          <w:rFonts w:ascii="Poppins" w:hAnsi="Poppins" w:cs="Poppins"/>
-          <w:sz w:val="20"/>
-          <w:szCs w:val="20"/>
-        </w:rPr>
-        <w:t>CI/CD</w:t>
-      </w:r>
+        <w:t>CRUD API -&gt; React Consume API -&gt; GSAP Animation -&gt; Contact SMTP -&gt; Download CV -&gt; Testing -&gt; Deploy -&gt; CI/CD</w:t>
+      </w:r>
+      <w:r>
+        <w:rPr>
+          <w:rFonts w:ascii="Poppins" w:hAnsi="Poppins" w:cs="Poppins"/>
+          <w:sz w:val="20"/>
+          <w:szCs w:val="20"/>
+        </w:rPr>
+        <w:br/>
+      </w:r>
+      <w:r>
+        <w:rPr>
+          <w:rFonts w:ascii="Poppins" w:hAnsi="Poppins" w:cs="Poppins"/>
+          <w:sz w:val="20"/>
+          <w:szCs w:val="20"/>
+        </w:rPr>
+        <w:br/>
+      </w:r>
+    </w:p>
+    <w:p>
+      <w:pPr>
+        <w:pStyle w:val="ListParagraph"/>
+        <w:jc w:val="both"/>
+        <w:rPr>
+          <w:rFonts w:ascii="Poppins" w:hAnsi="Poppins" w:cs="Poppins"/>
+          <w:sz w:val="20"/>
+          <w:szCs w:val="20"/>
+        </w:rPr>
+      </w:pPr>
     </w:p>
     <w:p>
       <w:pPr>
@@ -7378,6 +8293,119 @@
 <file path=word/numbering.xml><?xml version="1.0" encoding="utf-8"?>
 <w:numbering xmlns:wpc="http://schemas.microsoft.com/office/word/2010/wordprocessingCanvas" xmlns:cx="http://schemas.microsoft.com/office/drawing/2014/chartex" xmlns:cx1="http://schemas.microsoft.com/office/drawing/2015/9/8/chartex" xmlns:cx2="http://schemas.microsoft.com/office/drawing/2015/10/21/chartex" xmlns:cx3="http://schemas.microsoft.com/office/drawing/2016/5/9/chartex" xmlns:cx4="http://schemas.microsoft.com/office/drawing/2016/5/10/chartex" xmlns:cx5="http://schemas.microsoft.com/office/drawing/2016/5/11/chartex" xmlns:cx6="http://schemas.microsoft.com/office/drawing/2016/5/12/chartex" xmlns:cx7="http://schemas.microsoft.com/office/drawing/2016/5/13/chartex" xmlns:cx8="http://schemas.microsoft.com/office/drawing/2016/5/14/chartex" xmlns:mc="http://schemas.openxmlformats.org/markup-compatibility/2006" xmlns:aink="http://schemas.microsoft.com/office/drawing/2016/ink" xmlns:am3d="http://schemas.microsoft.com/office/drawing/2017/model3d" xmlns:o="urn:schemas-microsoft-com:office:office" xmlns:oel="http://schemas.microsoft.com/office/2019/extlst" xmlns:r="http://schemas.openxmlformats.org/officeDocument/2006/relationships" xmlns:m="http://schemas.openxmlformats.org/officeDocument/2006/math" xmlns:v="urn:schemas-microsoft-com:vml" xmlns:wp14="http://schemas.microsoft.com/office/word/2010/wordprocessingDrawing" xmlns:wp="http://schemas.openxmlformats.org/drawingml/2006/wordprocessingDrawing" xmlns:w10="urn:schemas-microsoft-com:office:word" xmlns:w="http://schemas.openxmlformats.org/wordprocessingml/2006/main" xmlns:w14="http://schemas.microsoft.com/office/word/2010/wordml" xmlns:w15="http://schemas.microsoft.com/office/word/2012/wordml" xmlns:w16cex="http://schemas.microsoft.com/office/word/2018/wordml/cex" xmlns:w16cid="http://schemas.microsoft.com/office/word/2016/wordml/cid" xmlns:w16="http://schemas.microsoft.com/office/word/2018/wordml" xmlns:w16du="http://schemas.microsoft.com/office/word/2023/wordml/word16du" xmlns:w16sdtdh="http://schemas.microsoft.com/office/word/2020/wordml/sdtdatahash" xmlns:w16sdtfl="http://schemas.microsoft.com/office/word/2024/wordml/sdtformatlock" xmlns:w16se="http://schemas.microsoft.com/office/word/2015/wordml/symex" xmlns:wpg="http://schemas.microsoft.com/office/word/2010/wordprocessingGroup" xmlns:wpi="http://schemas.microsoft.com/office/word/2010/wordprocessingInk" xmlns:wne="http://schemas.microsoft.com/office/word/2006/wordml" xmlns:wps="http://schemas.microsoft.com/office/word/2010/wordprocessingShape" mc:Ignorable="w14 w15 w16se w16cid w16 w16cex w16sdtdh w16sdtfl w16du wp14">
   <w:abstractNum w:abstractNumId="0" w15:restartNumberingAfterBreak="0">
+    <w:nsid w:val="32E233B6"/>
+    <w:multiLevelType w:val="hybridMultilevel"/>
+    <w:tmpl w:val="D4E85DB8"/>
+    <w:lvl w:ilvl="0" w:tplc="67F8F920">
+      <w:start w:val="3"/>
+      <w:numFmt w:val="bullet"/>
+      <w:lvlText w:val=""/>
+      <w:lvlJc w:val="left"/>
+      <w:pPr>
+        <w:ind w:left="1080" w:hanging="360"/>
+      </w:pPr>
+      <w:rPr>
+        <w:rFonts w:ascii="Symbol" w:eastAsiaTheme="minorHAnsi" w:hAnsi="Symbol" w:cs="Poppins" w:hint="default"/>
+      </w:rPr>
+    </w:lvl>
+    <w:lvl w:ilvl="1" w:tplc="04090003" w:tentative="1">
+      <w:start w:val="1"/>
+      <w:numFmt w:val="bullet"/>
+      <w:lvlText w:val="o"/>
+      <w:lvlJc w:val="left"/>
+      <w:pPr>
+        <w:ind w:left="1800" w:hanging="360"/>
+      </w:pPr>
+      <w:rPr>
+        <w:rFonts w:ascii="Courier New" w:hAnsi="Courier New" w:cs="Courier New" w:hint="default"/>
+      </w:rPr>
+    </w:lvl>
+    <w:lvl w:ilvl="2" w:tplc="04090005" w:tentative="1">
+      <w:start w:val="1"/>
+      <w:numFmt w:val="bullet"/>
+      <w:lvlText w:val=""/>
+      <w:lvlJc w:val="left"/>
+      <w:pPr>
+        <w:ind w:left="2520" w:hanging="360"/>
+      </w:pPr>
+      <w:rPr>
+        <w:rFonts w:ascii="Wingdings" w:hAnsi="Wingdings" w:hint="default"/>
+      </w:rPr>
+    </w:lvl>
+    <w:lvl w:ilvl="3" w:tplc="04090001" w:tentative="1">
+      <w:start w:val="1"/>
+      <w:numFmt w:val="bullet"/>
+      <w:lvlText w:val=""/>
+      <w:lvlJc w:val="left"/>
+      <w:pPr>
+        <w:ind w:left="3240" w:hanging="360"/>
+      </w:pPr>
+      <w:rPr>
+        <w:rFonts w:ascii="Symbol" w:hAnsi="Symbol" w:hint="default"/>
+      </w:rPr>
+    </w:lvl>
+    <w:lvl w:ilvl="4" w:tplc="04090003" w:tentative="1">
+      <w:start w:val="1"/>
+      <w:numFmt w:val="bullet"/>
+      <w:lvlText w:val="o"/>
+      <w:lvlJc w:val="left"/>
+      <w:pPr>
+        <w:ind w:left="3960" w:hanging="360"/>
+      </w:pPr>
+      <w:rPr>
+        <w:rFonts w:ascii="Courier New" w:hAnsi="Courier New" w:cs="Courier New" w:hint="default"/>
+      </w:rPr>
+    </w:lvl>
+    <w:lvl w:ilvl="5" w:tplc="04090005" w:tentative="1">
+      <w:start w:val="1"/>
+      <w:numFmt w:val="bullet"/>
+      <w:lvlText w:val=""/>
+      <w:lvlJc w:val="left"/>
+      <w:pPr>
+        <w:ind w:left="4680" w:hanging="360"/>
+      </w:pPr>
+      <w:rPr>
+        <w:rFonts w:ascii="Wingdings" w:hAnsi="Wingdings" w:hint="default"/>
+      </w:rPr>
+    </w:lvl>
+    <w:lvl w:ilvl="6" w:tplc="04090001" w:tentative="1">
+      <w:start w:val="1"/>
+      <w:numFmt w:val="bullet"/>
+      <w:lvlText w:val=""/>
+      <w:lvlJc w:val="left"/>
+      <w:pPr>
+        <w:ind w:left="5400" w:hanging="360"/>
+      </w:pPr>
+      <w:rPr>
+        <w:rFonts w:ascii="Symbol" w:hAnsi="Symbol" w:hint="default"/>
+      </w:rPr>
+    </w:lvl>
+    <w:lvl w:ilvl="7" w:tplc="04090003" w:tentative="1">
+      <w:start w:val="1"/>
+      <w:numFmt w:val="bullet"/>
+      <w:lvlText w:val="o"/>
+      <w:lvlJc w:val="left"/>
+      <w:pPr>
+        <w:ind w:left="6120" w:hanging="360"/>
+      </w:pPr>
+      <w:rPr>
+        <w:rFonts w:ascii="Courier New" w:hAnsi="Courier New" w:cs="Courier New" w:hint="default"/>
+      </w:rPr>
+    </w:lvl>
+    <w:lvl w:ilvl="8" w:tplc="04090005" w:tentative="1">
+      <w:start w:val="1"/>
+      <w:numFmt w:val="bullet"/>
+      <w:lvlText w:val=""/>
+      <w:lvlJc w:val="left"/>
+      <w:pPr>
+        <w:ind w:left="6840" w:hanging="360"/>
+      </w:pPr>
+      <w:rPr>
+        <w:rFonts w:ascii="Wingdings" w:hAnsi="Wingdings" w:hint="default"/>
+      </w:rPr>
+    </w:lvl>
+  </w:abstractNum>
+  <w:abstractNum w:abstractNumId="1" w15:restartNumberingAfterBreak="0">
     <w:nsid w:val="3E173642"/>
     <w:multiLevelType w:val="hybridMultilevel"/>
     <w:tmpl w:val="DEEA49C8"/>
@@ -7466,7 +8494,7 @@
       </w:pPr>
     </w:lvl>
   </w:abstractNum>
-  <w:abstractNum w:abstractNumId="1" w15:restartNumberingAfterBreak="0">
+  <w:abstractNum w:abstractNumId="2" w15:restartNumberingAfterBreak="0">
     <w:nsid w:val="555B5A9E"/>
     <w:multiLevelType w:val="multilevel"/>
     <w:tmpl w:val="2D7679A2"/>
@@ -7615,11 +8643,130 @@
       </w:rPr>
     </w:lvl>
   </w:abstractNum>
+  <w:abstractNum w:abstractNumId="3" w15:restartNumberingAfterBreak="0">
+    <w:nsid w:val="726300B0"/>
+    <w:multiLevelType w:val="hybridMultilevel"/>
+    <w:tmpl w:val="81007B96"/>
+    <w:lvl w:ilvl="0" w:tplc="F1EA1E0E">
+      <w:start w:val="3"/>
+      <w:numFmt w:val="bullet"/>
+      <w:lvlText w:val=""/>
+      <w:lvlJc w:val="left"/>
+      <w:pPr>
+        <w:ind w:left="720" w:hanging="360"/>
+      </w:pPr>
+      <w:rPr>
+        <w:rFonts w:ascii="Symbol" w:eastAsiaTheme="minorHAnsi" w:hAnsi="Symbol" w:cs="Poppins" w:hint="default"/>
+      </w:rPr>
+    </w:lvl>
+    <w:lvl w:ilvl="1" w:tplc="04090003" w:tentative="1">
+      <w:start w:val="1"/>
+      <w:numFmt w:val="bullet"/>
+      <w:lvlText w:val="o"/>
+      <w:lvlJc w:val="left"/>
+      <w:pPr>
+        <w:ind w:left="1440" w:hanging="360"/>
+      </w:pPr>
+      <w:rPr>
+        <w:rFonts w:ascii="Courier New" w:hAnsi="Courier New" w:cs="Courier New" w:hint="default"/>
+      </w:rPr>
+    </w:lvl>
+    <w:lvl w:ilvl="2" w:tplc="04090005" w:tentative="1">
+      <w:start w:val="1"/>
+      <w:numFmt w:val="bullet"/>
+      <w:lvlText w:val=""/>
+      <w:lvlJc w:val="left"/>
+      <w:pPr>
+        <w:ind w:left="2160" w:hanging="360"/>
+      </w:pPr>
+      <w:rPr>
+        <w:rFonts w:ascii="Wingdings" w:hAnsi="Wingdings" w:hint="default"/>
+      </w:rPr>
+    </w:lvl>
+    <w:lvl w:ilvl="3" w:tplc="04090001" w:tentative="1">
+      <w:start w:val="1"/>
+      <w:numFmt w:val="bullet"/>
+      <w:lvlText w:val=""/>
+      <w:lvlJc w:val="left"/>
+      <w:pPr>
+        <w:ind w:left="2880" w:hanging="360"/>
+      </w:pPr>
+      <w:rPr>
+        <w:rFonts w:ascii="Symbol" w:hAnsi="Symbol" w:hint="default"/>
+      </w:rPr>
+    </w:lvl>
+    <w:lvl w:ilvl="4" w:tplc="04090003" w:tentative="1">
+      <w:start w:val="1"/>
+      <w:numFmt w:val="bullet"/>
+      <w:lvlText w:val="o"/>
+      <w:lvlJc w:val="left"/>
+      <w:pPr>
+        <w:ind w:left="3600" w:hanging="360"/>
+      </w:pPr>
+      <w:rPr>
+        <w:rFonts w:ascii="Courier New" w:hAnsi="Courier New" w:cs="Courier New" w:hint="default"/>
+      </w:rPr>
+    </w:lvl>
+    <w:lvl w:ilvl="5" w:tplc="04090005" w:tentative="1">
+      <w:start w:val="1"/>
+      <w:numFmt w:val="bullet"/>
+      <w:lvlText w:val=""/>
+      <w:lvlJc w:val="left"/>
+      <w:pPr>
+        <w:ind w:left="4320" w:hanging="360"/>
+      </w:pPr>
+      <w:rPr>
+        <w:rFonts w:ascii="Wingdings" w:hAnsi="Wingdings" w:hint="default"/>
+      </w:rPr>
+    </w:lvl>
+    <w:lvl w:ilvl="6" w:tplc="04090001" w:tentative="1">
+      <w:start w:val="1"/>
+      <w:numFmt w:val="bullet"/>
+      <w:lvlText w:val=""/>
+      <w:lvlJc w:val="left"/>
+      <w:pPr>
+        <w:ind w:left="5040" w:hanging="360"/>
+      </w:pPr>
+      <w:rPr>
+        <w:rFonts w:ascii="Symbol" w:hAnsi="Symbol" w:hint="default"/>
+      </w:rPr>
+    </w:lvl>
+    <w:lvl w:ilvl="7" w:tplc="04090003" w:tentative="1">
+      <w:start w:val="1"/>
+      <w:numFmt w:val="bullet"/>
+      <w:lvlText w:val="o"/>
+      <w:lvlJc w:val="left"/>
+      <w:pPr>
+        <w:ind w:left="5760" w:hanging="360"/>
+      </w:pPr>
+      <w:rPr>
+        <w:rFonts w:ascii="Courier New" w:hAnsi="Courier New" w:cs="Courier New" w:hint="default"/>
+      </w:rPr>
+    </w:lvl>
+    <w:lvl w:ilvl="8" w:tplc="04090005" w:tentative="1">
+      <w:start w:val="1"/>
+      <w:numFmt w:val="bullet"/>
+      <w:lvlText w:val=""/>
+      <w:lvlJc w:val="left"/>
+      <w:pPr>
+        <w:ind w:left="6480" w:hanging="360"/>
+      </w:pPr>
+      <w:rPr>
+        <w:rFonts w:ascii="Wingdings" w:hAnsi="Wingdings" w:hint="default"/>
+      </w:rPr>
+    </w:lvl>
+  </w:abstractNum>
   <w:num w:numId="1" w16cid:durableId="2034334207">
+    <w:abstractNumId w:val="1"/>
+  </w:num>
+  <w:num w:numId="2" w16cid:durableId="1560482607">
+    <w:abstractNumId w:val="2"/>
+  </w:num>
+  <w:num w:numId="3" w16cid:durableId="1775176108">
     <w:abstractNumId w:val="0"/>
   </w:num>
-  <w:num w:numId="2" w16cid:durableId="1560482607">
-    <w:abstractNumId w:val="1"/>
+  <w:num w:numId="4" w16cid:durableId="1541697889">
+    <w:abstractNumId w:val="3"/>
   </w:num>
 </w:numbering>
 </file>
@@ -8227,6 +9374,7 @@
   <w:style w:type="character" w:default="1" w:styleId="DefaultParagraphFont">
     <w:name w:val="Default Paragraph Font"/>
     <w:uiPriority w:val="1"/>
+    <w:semiHidden/>
     <w:unhideWhenUsed/>
   </w:style>
   <w:style w:type="table" w:default="1" w:styleId="TableNormal">
@@ -8578,6 +9726,29 @@
       </w:tblBorders>
     </w:tblPr>
   </w:style>
+  <w:style w:type="character" w:styleId="Hyperlink">
+    <w:name w:val="Hyperlink"/>
+    <w:basedOn w:val="DefaultParagraphFont"/>
+    <w:uiPriority w:val="99"/>
+    <w:unhideWhenUsed/>
+    <w:rsid w:val="00460DB8"/>
+    <w:rPr>
+      <w:color w:val="467886" w:themeColor="hyperlink"/>
+      <w:u w:val="single"/>
+    </w:rPr>
+  </w:style>
+  <w:style w:type="character" w:styleId="UnresolvedMention">
+    <w:name w:val="Unresolved Mention"/>
+    <w:basedOn w:val="DefaultParagraphFont"/>
+    <w:uiPriority w:val="99"/>
+    <w:semiHidden/>
+    <w:unhideWhenUsed/>
+    <w:rsid w:val="00460DB8"/>
+    <w:rPr>
+      <w:color w:val="605E5C"/>
+      <w:shd w:val="clear" w:color="auto" w:fill="E1DFDD"/>
+    </w:rPr>
+  </w:style>
 </w:styles>
 </file>
 

</xml_diff>